<commit_message>
ETI: Informe Check List con formato actualizado CAP-SC-10 (rango de fechas, conclusiones del supervisor, Foto 1-4, firma digital)
</commit_message>
<xml_diff>
--- a/lib/plantilla-informe-checklist-eti.docx
+++ b/lib/plantilla-informe-checklist-eti.docx
@@ -9,7 +9,7 @@
           <w:ilvl w:val="0"/>
           <w:numId w:val="8"/>
         </w:numPr>
-        <w:spacing w:after="0" w:line="240" w:lineRule="auto"/>
+        <w:spacing w:after="0" w:line="360" w:lineRule="auto"/>
         <w:ind w:left="284" w:hanging="284"/>
         <w:jc w:val="both"/>
         <w:rPr>
@@ -33,6 +33,7 @@
     </w:p>
     <w:p>
       <w:pPr>
+        <w:spacing w:line="360" w:lineRule="auto"/>
         <w:jc w:val="both"/>
         <w:rPr>
           <w:rFonts w:ascii="Arial" w:hAnsi="Arial" w:cs="Arial"/>
@@ -79,7 +80,7 @@
               </wp:anchor>
             </w:drawing>
           </mc:Choice>
-          <mc:Fallback>
+          <mc:Fallback xmlns:w16cei="http://schemas.microsoft.com/office/word/2026/wordml/cei" xmlns:pic="http://schemas.openxmlformats.org/drawingml/2006/picture" xmlns:a="http://schemas.openxmlformats.org/drawingml/2006/main">
             <w:drawing>
               <wp:anchor distT="0" distB="0" distL="114300" distR="114300" simplePos="0" relativeHeight="251666944" behindDoc="0" locked="0" layoutInCell="1" allowOverlap="1" wp14:anchorId="6887E68B" wp14:editId="40A440D5">
                 <wp:simplePos x="0" y="0"/>
@@ -127,126 +128,11 @@
     </w:p>
     <w:p>
       <w:pPr>
+        <w:spacing w:line="360" w:lineRule="auto"/>
         <w:jc w:val="both"/>
         <w:rPr>
           <w:rFonts w:ascii="Arial" w:hAnsi="Arial" w:cs="Arial"/>
-        </w:rPr>
-      </w:pPr>
-      <w:r>
-        <w:rPr>
-          <w:rFonts w:ascii="Arial" w:hAnsi="Arial" w:cs="Arial"/>
-          <w:b/>
-          <w:bCs/>
-        </w:rPr>
-        <w:t>Empresa:</w:t>
-      </w:r>
-      <w:r>
-        <w:rPr>
-          <w:rFonts w:ascii="Arial" w:hAnsi="Arial" w:cs="Arial"/>
-          <w:b/>
-          <w:bCs/>
-        </w:rPr>
-        <w:tab/>
-      </w:r>
-      <w:r>
-        <w:rPr>
-          <w:rFonts w:ascii="Arial" w:hAnsi="Arial" w:cs="Arial"/>
-          <w:b/>
-          <w:bCs/>
-        </w:rPr>
-        <w:tab/>
-      </w:r>
-      <w:r>
-        <w:rPr>
-          <w:rFonts w:ascii="Arial" w:hAnsi="Arial" w:cs="Arial"/>
-        </w:rPr>
-        <w:t xml:space="preserve">{{EMPRESA}}</w:t>
-      </w:r>
-    </w:p>
-    <w:p>
-      <w:pPr>
-        <w:ind w:left="2124" w:hanging="2124"/>
-        <w:jc w:val="both"/>
-        <w:rPr>
-          <w:rFonts w:ascii="Arial" w:hAnsi="Arial" w:cs="Arial"/>
-          <w:color w:val="EE0000"/>
-        </w:rPr>
-      </w:pPr>
-      <w:r>
-        <w:rPr>
-          <w:rFonts w:ascii="Arial" w:hAnsi="Arial" w:cs="Arial"/>
-          <w:b/>
-          <w:bCs/>
-        </w:rPr>
-        <w:t xml:space="preserve">Tema: </w:t>
-      </w:r>
-      <w:r>
-        <w:rPr>
-          <w:rFonts w:ascii="Arial" w:hAnsi="Arial" w:cs="Arial"/>
-          <w:b/>
-          <w:bCs/>
-        </w:rPr>
-        <w:tab/>
-      </w:r>
-      <w:r>
-        <w:rPr>
-          <w:rFonts w:ascii="Arial" w:hAnsi="Arial" w:cs="Arial"/>
-        </w:rPr>
-        <w:t>Buenas Prácticas Sociales, Laborales, Comercio Ético y Sustentabilidad / Ética Empresarial</w:t>
-      </w:r>
-    </w:p>
-    <w:p>
-      <w:pPr>
-        <w:jc w:val="both"/>
-        <w:rPr>
-          <w:rFonts w:ascii="Arial" w:hAnsi="Arial" w:cs="Arial"/>
           <w:lang w:val="es-ES"/>
-        </w:rPr>
-      </w:pPr>
-      <w:r>
-        <w:rPr>
-          <w:rFonts w:ascii="Arial" w:hAnsi="Arial" w:cs="Arial"/>
-          <w:b/>
-          <w:bCs/>
-        </w:rPr>
-        <w:t>Ejecutado por:</w:t>
-      </w:r>
-      <w:r>
-        <w:rPr>
-          <w:rFonts w:ascii="Arial" w:hAnsi="Arial" w:cs="Arial"/>
-          <w:b/>
-          <w:bCs/>
-        </w:rPr>
-        <w:tab/>
-      </w:r>
-      <w:r>
-        <w:rPr>
-          <w:rFonts w:ascii="Arial" w:hAnsi="Arial" w:cs="Arial"/>
-        </w:rPr>
-        <w:tab/>
-      </w:r>
-      <w:r>
-        <w:rPr>
-          <w:rFonts w:ascii="Arial" w:hAnsi="Arial" w:cs="Arial"/>
-          <w:lang w:val="es-ES"/>
-        </w:rPr>
-        <w:t>Supervisor de Gestión Humana</w:t>
-      </w:r>
-      <w:r>
-        <w:rPr>
-          <w:rFonts w:ascii="Arial" w:hAnsi="Arial" w:cs="Arial"/>
-          <w:lang w:val="es-ES"/>
-        </w:rPr>
-        <w:t xml:space="preserve"> – Dpto. de Gestión Humana.</w:t>
-      </w:r>
-    </w:p>
-    <w:p>
-      <w:pPr>
-        <w:jc w:val="both"/>
-        <w:rPr>
-          <w:rFonts w:ascii="Arial" w:hAnsi="Arial" w:cs="Arial"/>
-          <w:b/>
-          <w:bCs/>
         </w:rPr>
       </w:pPr>
       <w:r>
@@ -256,8 +142,123 @@
           <w:bCs/>
           <w:lang w:val="es-ES"/>
         </w:rPr>
-        <w:t xml:space="preserve">Reportado a: </w:t>
-      </w:r>
+        <w:t>Empresa:</w:t>
+      </w:r>
+      <w:r>
+        <w:rPr>
+          <w:rFonts w:ascii="Arial" w:hAnsi="Arial" w:cs="Arial"/>
+        </w:rPr>
+        <w:tab/>
+      </w:r>
+      <w:r>
+        <w:rPr>
+          <w:rFonts w:ascii="Arial" w:hAnsi="Arial" w:cs="Arial"/>
+        </w:rPr>
+        <w:tab/>
+      </w:r>
+      <w:r>
+        <w:rPr>
+          <w:rFonts w:ascii="Arial" w:hAnsi="Arial" w:cs="Arial"/>
+          <w:lang w:val="es-ES"/>
+        </w:rPr>
+        <w:t xml:space="preserve">{{EMPRESA}}</w:t>
+      </w:r>
+    </w:p>
+    <w:p>
+      <w:pPr>
+        <w:spacing w:after="160" w:line="360" w:lineRule="auto"/>
+        <w:ind w:left="2124" w:right="-1" w:hanging="2124"/>
+        <w:jc w:val="both"/>
+        <w:rPr>
+          <w:rFonts w:ascii="Arial" w:hAnsi="Arial" w:cs="Arial"/>
+        </w:rPr>
+      </w:pPr>
+      <w:r>
+        <w:rPr>
+          <w:rFonts w:ascii="Arial" w:hAnsi="Arial" w:cs="Arial"/>
+          <w:b/>
+          <w:bCs/>
+        </w:rPr>
+        <w:t xml:space="preserve">Tema: </w:t>
+      </w:r>
+      <w:r>
+        <w:rPr>
+          <w:rFonts w:ascii="Arial" w:hAnsi="Arial" w:cs="Arial"/>
+          <w:b/>
+          <w:bCs/>
+        </w:rPr>
+        <w:tab/>
+      </w:r>
+      <w:r>
+        <w:rPr>
+          <w:rFonts w:ascii="Arial" w:hAnsi="Arial" w:cs="Arial"/>
+        </w:rPr>
+        <w:t xml:space="preserve">CAP-SC-10. </w:t>
+      </w:r>
+      <w:r>
+        <w:rPr>
+          <w:rFonts w:ascii="Arial" w:hAnsi="Arial" w:cs="Arial"/>
+        </w:rPr>
+        <w:t>LEGISLACIÓN LABORAL, MECANISMO DE QUEJAS Y SUGERENCIAS, HOSTIGAMIENTO SEXUAL, CÓDIGO DE CONDUCTA, MEDIOAMBIENTE, ÉTICA EMPRESARIAL</w:t>
+      </w:r>
+      <w:r>
+        <w:rPr>
+          <w:rFonts w:ascii="Arial" w:hAnsi="Arial" w:cs="Arial"/>
+        </w:rPr>
+        <w:t>.</w:t>
+      </w:r>
+    </w:p>
+    <w:p>
+      <w:pPr>
+        <w:spacing w:line="360" w:lineRule="auto"/>
+        <w:ind w:left="2124" w:hanging="2124"/>
+        <w:jc w:val="both"/>
+        <w:rPr>
+          <w:rFonts w:ascii="Arial" w:hAnsi="Arial" w:cs="Arial"/>
+          <w:lang w:val="es-ES"/>
+        </w:rPr>
+      </w:pPr>
+      <w:r>
+        <w:rPr>
+          <w:rFonts w:ascii="Arial" w:hAnsi="Arial" w:cs="Arial"/>
+          <w:b/>
+          <w:bCs/>
+        </w:rPr>
+        <w:t>Ejecutado por:</w:t>
+      </w:r>
+      <w:r>
+        <w:rPr>
+          <w:rFonts w:ascii="Arial" w:hAnsi="Arial" w:cs="Arial"/>
+          <w:b/>
+          <w:bCs/>
+        </w:rPr>
+        <w:tab/>
+      </w:r>
+      <w:r>
+        <w:rPr>
+          <w:rFonts w:ascii="Arial" w:hAnsi="Arial" w:cs="Arial"/>
+          <w:lang w:val="es-ES"/>
+        </w:rPr>
+        <w:t>Supervisor de Gestión Humana</w:t>
+      </w:r>
+      <w:r>
+        <w:rPr>
+          <w:rFonts w:ascii="Arial" w:hAnsi="Arial" w:cs="Arial"/>
+          <w:lang w:val="es-ES"/>
+        </w:rPr>
+        <w:t xml:space="preserve"> – Dpto. de Gestión Humana.</w:t>
+      </w:r>
+    </w:p>
+    <w:p>
+      <w:pPr>
+        <w:spacing w:line="360" w:lineRule="auto"/>
+        <w:jc w:val="both"/>
+        <w:rPr>
+          <w:rFonts w:ascii="Arial" w:hAnsi="Arial" w:cs="Arial"/>
+          <w:b/>
+          <w:bCs/>
+        </w:rPr>
+      </w:pPr>
       <w:r>
         <w:rPr>
           <w:rFonts w:ascii="Arial" w:hAnsi="Arial" w:cs="Arial"/>
@@ -265,7 +266,7 @@
           <w:bCs/>
           <w:lang w:val="es-ES"/>
         </w:rPr>
-        <w:tab/>
+        <w:t xml:space="preserve">Reportado a: </w:t>
       </w:r>
       <w:r>
         <w:rPr>
@@ -279,173 +280,175 @@
       <w:r>
         <w:rPr>
           <w:rFonts w:ascii="Arial" w:hAnsi="Arial" w:cs="Arial"/>
-        </w:rPr>
-        <w:t xml:space="preserve">{{REPORTADO}}</w:t>
-      </w:r>
-      <w:r>
-        <w:rPr>
-          <w:rFonts w:ascii="Arial" w:hAnsi="Arial" w:cs="Arial"/>
-        </w:rPr>
-        <w:t>.</w:t>
-      </w:r>
-    </w:p>
-    <w:p>
-      <w:pPr>
-        <w:spacing w:line="276" w:lineRule="auto"/>
-        <w:jc w:val="both"/>
-        <w:rPr>
-          <w:rFonts w:ascii="Arial" w:hAnsi="Arial" w:cs="Arial"/>
-        </w:rPr>
-      </w:pPr>
-      <w:r>
-        <w:rPr>
-          <w:rFonts w:ascii="Arial" w:hAnsi="Arial" w:cs="Arial"/>
-          <w:b/>
-          <w:bCs/>
-        </w:rPr>
-        <w:t xml:space="preserve">Mes: </w:t>
-      </w:r>
-      <w:r>
-        <w:rPr>
-          <w:rFonts w:ascii="Arial" w:hAnsi="Arial" w:cs="Arial"/>
-          <w:b/>
-          <w:bCs/>
-        </w:rPr>
-        <w:tab/>
-      </w:r>
-      <w:r>
-        <w:rPr>
-          <w:rFonts w:ascii="Arial" w:hAnsi="Arial" w:cs="Arial"/>
-          <w:b/>
-          <w:bCs/>
-        </w:rPr>
-        <w:tab/>
-      </w:r>
-      <w:r>
-        <w:rPr>
-          <w:rFonts w:ascii="Arial" w:hAnsi="Arial" w:cs="Arial"/>
-          <w:b/>
-          <w:bCs/>
-        </w:rPr>
-        <w:tab/>
-      </w:r>
-      <w:r>
-        <w:rPr>
-          <w:rFonts w:ascii="Arial" w:hAnsi="Arial" w:cs="Arial"/>
-          <w:lang w:val="es-ES"/>
-        </w:rPr>
-        <w:t xml:space="preserve">{{MES}}</w:t>
-      </w:r>
-      <w:r>
-        <w:rPr>
-          <w:rFonts w:ascii="Arial" w:hAnsi="Arial" w:cs="Arial"/>
-          <w:lang w:val="es-ES"/>
-        </w:rPr>
-        <w:t>.</w:t>
-      </w:r>
-    </w:p>
-    <w:p>
-      <w:pPr>
-        <w:jc w:val="both"/>
-        <w:rPr>
-          <w:rFonts w:ascii="Arial" w:hAnsi="Arial" w:cs="Arial"/>
-          <w:lang w:val="es-ES"/>
-        </w:rPr>
-      </w:pPr>
-      <w:r>
-        <w:rPr>
-          <w:rFonts w:ascii="Arial" w:hAnsi="Arial" w:cs="Arial"/>
-          <w:b/>
-          <w:bCs/>
-        </w:rPr>
-        <w:t>Fecha de informe:</w:t>
-      </w:r>
-      <w:r>
-        <w:rPr>
-          <w:rFonts w:ascii="Arial" w:hAnsi="Arial" w:cs="Arial"/>
-        </w:rPr>
-        <w:tab/>
-      </w:r>
-      <w:r>
-        <w:rPr>
-          <w:rFonts w:ascii="Arial" w:hAnsi="Arial" w:cs="Arial"/>
-          <w:lang w:val="es-ES"/>
-        </w:rPr>
-        <w:t xml:space="preserve">{{FINF}}</w:t>
-      </w:r>
-      <w:r>
-        <w:rPr>
-          <w:rFonts w:ascii="Arial" w:hAnsi="Arial" w:cs="Arial"/>
-          <w:lang w:val="es-ES"/>
-        </w:rPr>
-        <w:t xml:space="preserve"> (SEM </w:t>
-      </w:r>
-      <w:r>
-        <w:rPr>
-          <w:rFonts w:ascii="Arial" w:hAnsi="Arial" w:cs="Arial"/>
-          <w:lang w:val="es-ES"/>
-        </w:rPr>
-        <w:t xml:space="preserve">{{SEMINF}}</w:t>
-      </w:r>
-      <w:r>
-        <w:rPr>
-          <w:rFonts w:ascii="Arial" w:hAnsi="Arial" w:cs="Arial"/>
-          <w:lang w:val="es-ES"/>
-        </w:rPr>
-        <w:t>)</w:t>
-      </w:r>
-    </w:p>
-    <w:p>
-      <w:pPr>
-        <w:jc w:val="both"/>
-        <w:rPr>
-          <w:rFonts w:ascii="Arial" w:hAnsi="Arial" w:cs="Arial"/>
-        </w:rPr>
-      </w:pPr>
-      <w:r>
-        <w:rPr>
-          <w:rFonts w:ascii="Arial" w:hAnsi="Arial" w:cs="Arial"/>
           <w:b/>
           <w:bCs/>
           <w:lang w:val="es-ES"/>
         </w:rPr>
-        <w:t>Tipo:</w:t>
-      </w:r>
+        <w:tab/>
+      </w:r>
+      <w:r>
+        <w:rPr>
+          <w:rFonts w:ascii="Arial" w:hAnsi="Arial" w:cs="Arial"/>
+          <w:lang w:val="es-ES"/>
+        </w:rPr>
+        <w:t xml:space="preserve">{{REPORTADO}}</w:t>
+      </w:r>
+      <w:r>
+        <w:rPr>
+          <w:rFonts w:ascii="Arial" w:hAnsi="Arial" w:cs="Arial"/>
+          <w:lang w:val="es-ES"/>
+        </w:rPr>
+        <w:t xml:space="preserve"/>
+      </w:r>
+      <w:r>
+        <w:rPr>
+          <w:rFonts w:ascii="Arial" w:hAnsi="Arial" w:cs="Arial"/>
+          <w:lang w:val="es-ES"/>
+        </w:rPr>
+        <w:t xml:space="preserve"/>
+      </w:r>
+    </w:p>
+    <w:p>
+      <w:pPr>
+        <w:spacing w:line="360" w:lineRule="auto"/>
+        <w:jc w:val="both"/>
+        <w:rPr>
+          <w:rFonts w:ascii="Arial" w:hAnsi="Arial" w:cs="Arial"/>
+          <w:color w:val="FF0000"/>
+        </w:rPr>
+      </w:pPr>
       <w:r>
         <w:rPr>
           <w:rFonts w:ascii="Arial" w:hAnsi="Arial" w:cs="Arial"/>
           <w:b/>
           <w:bCs/>
-          <w:lang w:val="es-ES"/>
-        </w:rPr>
-        <w:tab/>
+        </w:rPr>
+        <w:t xml:space="preserve">Mes: </w:t>
       </w:r>
       <w:r>
         <w:rPr>
           <w:rFonts w:ascii="Arial" w:hAnsi="Arial" w:cs="Arial"/>
           <w:b/>
           <w:bCs/>
+        </w:rPr>
+        <w:tab/>
+      </w:r>
+      <w:r>
+        <w:rPr>
+          <w:rFonts w:ascii="Arial" w:hAnsi="Arial" w:cs="Arial"/>
+          <w:b/>
+          <w:bCs/>
+        </w:rPr>
+        <w:tab/>
+      </w:r>
+      <w:r>
+        <w:rPr>
+          <w:rFonts w:ascii="Arial" w:hAnsi="Arial" w:cs="Arial"/>
+          <w:b/>
+          <w:bCs/>
+        </w:rPr>
+        <w:tab/>
+      </w:r>
+      <w:r>
+        <w:rPr>
+          <w:rFonts w:ascii="Arial" w:hAnsi="Arial" w:cs="Arial"/>
+          <w:color w:val="EE0000"/>
           <w:lang w:val="es-ES"/>
         </w:rPr>
+        <w:t xml:space="preserve">{{MES}}</w:t>
+      </w:r>
+    </w:p>
+    <w:p>
+      <w:pPr>
+        <w:spacing w:line="360" w:lineRule="auto"/>
+        <w:jc w:val="both"/>
+        <w:rPr>
+          <w:rFonts w:ascii="Arial" w:hAnsi="Arial" w:cs="Arial"/>
+          <w:color w:val="000000" w:themeColor="text1"/>
+          <w:lang w:val="es-ES"/>
+        </w:rPr>
+      </w:pPr>
+      <w:r>
+        <w:rPr>
+          <w:rFonts w:ascii="Arial" w:hAnsi="Arial" w:cs="Arial"/>
+          <w:b/>
+          <w:bCs/>
+        </w:rPr>
+        <w:t>Fecha de informe:</w:t>
+      </w:r>
+      <w:r>
+        <w:rPr>
+          <w:rFonts w:ascii="Arial" w:hAnsi="Arial" w:cs="Arial"/>
+        </w:rPr>
         <w:tab/>
       </w:r>
       <w:r>
         <w:rPr>
           <w:rFonts w:ascii="Arial" w:hAnsi="Arial" w:cs="Arial"/>
+          <w:color w:val="EE0000"/>
           <w:lang w:val="es-ES"/>
         </w:rPr>
+        <w:t xml:space="preserve">{{FINF}} (SEM {{SEMINF}})</w:t>
+      </w:r>
+    </w:p>
+    <w:p>
+      <w:pPr>
+        <w:spacing w:line="360" w:lineRule="auto"/>
+        <w:jc w:val="both"/>
+        <w:rPr>
+          <w:rFonts w:ascii="Arial" w:hAnsi="Arial" w:cs="Arial"/>
+        </w:rPr>
+      </w:pPr>
+      <w:r>
+        <w:rPr>
+          <w:rFonts w:ascii="Arial" w:hAnsi="Arial" w:cs="Arial"/>
+          <w:b/>
+          <w:bCs/>
+          <w:color w:val="000000" w:themeColor="text1"/>
+          <w:lang w:val="es-ES"/>
+        </w:rPr>
+        <w:t>Tipo:</w:t>
+      </w:r>
+      <w:r>
+        <w:rPr>
+          <w:rFonts w:ascii="Arial" w:hAnsi="Arial" w:cs="Arial"/>
+          <w:b/>
+          <w:bCs/>
+          <w:color w:val="000000" w:themeColor="text1"/>
+          <w:lang w:val="es-ES"/>
+        </w:rPr>
         <w:tab/>
       </w:r>
       <w:r>
         <w:rPr>
           <w:rFonts w:ascii="Arial" w:hAnsi="Arial" w:cs="Arial"/>
+          <w:b/>
+          <w:bCs/>
+          <w:color w:val="000000" w:themeColor="text1"/>
           <w:lang w:val="es-ES"/>
         </w:rPr>
+        <w:tab/>
+      </w:r>
+      <w:r>
+        <w:rPr>
+          <w:rFonts w:ascii="Arial" w:hAnsi="Arial" w:cs="Arial"/>
+          <w:color w:val="000000" w:themeColor="text1"/>
+          <w:lang w:val="es-ES"/>
+        </w:rPr>
+        <w:tab/>
+      </w:r>
+      <w:r>
+        <w:rPr>
+          <w:rFonts w:ascii="Arial" w:hAnsi="Arial" w:cs="Arial"/>
+          <w:color w:val="EE0000"/>
+          <w:lang w:val="es-ES"/>
+        </w:rPr>
         <w:t>Entrevista para medir el conocimiento del personal (CHECK LIST)</w:t>
       </w:r>
     </w:p>
     <w:p>
       <w:pPr>
+        <w:spacing w:line="360" w:lineRule="auto"/>
         <w:ind w:left="1080" w:hanging="720"/>
         <w:jc w:val="both"/>
         <w:rPr>
@@ -460,7 +463,7 @@
           <w:ilvl w:val="0"/>
           <w:numId w:val="7"/>
         </w:numPr>
-        <w:spacing w:after="0" w:line="240" w:lineRule="auto"/>
+        <w:spacing w:after="0" w:line="360" w:lineRule="auto"/>
         <w:ind w:left="284" w:hanging="284"/>
         <w:jc w:val="both"/>
         <w:rPr>
@@ -484,6 +487,7 @@
     </w:p>
     <w:p>
       <w:pPr>
+        <w:spacing w:line="360" w:lineRule="auto"/>
         <w:jc w:val="both"/>
         <w:rPr>
           <w:rFonts w:ascii="Arial" w:hAnsi="Arial" w:cs="Arial"/>
@@ -494,8 +498,8 @@
     </w:p>
     <w:p>
       <w:pPr>
-        <w:spacing w:after="160" w:line="276" w:lineRule="auto"/>
-        <w:ind w:left="709" w:right="-1"/>
+        <w:spacing w:after="160" w:line="360" w:lineRule="auto"/>
+        <w:ind w:right="-1" w:firstLine="284"/>
         <w:jc w:val="both"/>
         <w:rPr>
           <w:rFonts w:ascii="Arial" w:hAnsi="Arial" w:cs="Arial"/>
@@ -505,12 +509,30 @@
         <w:rPr>
           <w:rFonts w:ascii="Arial" w:hAnsi="Arial" w:cs="Arial"/>
         </w:rPr>
-        <w:t>Aplicación de la evaluación escrita para medir el conocimiento del personal sobre ética y sustentabilidad luego de la capacitación realizada.</w:t>
-      </w:r>
-    </w:p>
-    <w:p>
-      <w:pPr>
-        <w:spacing w:after="160" w:line="276" w:lineRule="auto"/>
+        <w:t>Aplicación de la evaluación escrita para medir el conocimiento del personal sobre ética y sustentabilidad luego de la capacitación realizada</w:t>
+      </w:r>
+      <w:r>
+        <w:rPr>
+          <w:rFonts w:ascii="Arial" w:hAnsi="Arial" w:cs="Arial"/>
+        </w:rPr>
+        <w:t xml:space="preserve"> en base al CAP-SC-10. </w:t>
+      </w:r>
+      <w:r>
+        <w:rPr>
+          <w:rFonts w:ascii="Arial" w:hAnsi="Arial" w:cs="Arial"/>
+        </w:rPr>
+        <w:t>LEGISLACIÓN LABORAL, MECANISMO DE QUEJAS Y SUGERENCIAS, HOSTIGAMIENTO SEXUAL, CÓDIGO DE CONDUCTA, MEDIOAMBIENTE, ÉTICA EMPRESARIAL</w:t>
+      </w:r>
+      <w:r>
+        <w:rPr>
+          <w:rFonts w:ascii="Arial" w:hAnsi="Arial" w:cs="Arial"/>
+        </w:rPr>
+        <w:t>.</w:t>
+      </w:r>
+    </w:p>
+    <w:p>
+      <w:pPr>
+        <w:spacing w:after="160" w:line="360" w:lineRule="auto"/>
         <w:ind w:left="709" w:right="-1"/>
         <w:jc w:val="both"/>
         <w:rPr>
@@ -525,7 +547,7 @@
           <w:ilvl w:val="0"/>
           <w:numId w:val="7"/>
         </w:numPr>
-        <w:spacing w:after="0" w:line="240" w:lineRule="auto"/>
+        <w:spacing w:after="0" w:line="360" w:lineRule="auto"/>
         <w:ind w:left="426" w:hanging="426"/>
         <w:jc w:val="both"/>
         <w:rPr>
@@ -549,18 +571,8 @@
     </w:p>
     <w:p>
       <w:pPr>
-        <w:jc w:val="both"/>
-        <w:rPr>
-          <w:rFonts w:ascii="Arial" w:hAnsi="Arial" w:cs="Arial"/>
-          <w:b/>
-          <w:bCs/>
-        </w:rPr>
-      </w:pPr>
-    </w:p>
-    <w:p>
-      <w:pPr>
         <w:pStyle w:val="Prrafodelista"/>
-        <w:spacing w:after="0" w:line="240" w:lineRule="auto"/>
+        <w:spacing w:after="0" w:line="360" w:lineRule="auto"/>
         <w:ind w:left="426"/>
         <w:jc w:val="both"/>
         <w:rPr>
@@ -574,7 +586,7 @@
     </w:p>
     <w:tbl>
       <w:tblPr>
-        <w:tblW w:w="9051" w:type="dxa"/>
+        <w:tblW w:w="8800" w:type="dxa"/>
         <w:jc w:val="center"/>
         <w:tblCellMar>
           <w:left w:w="70" w:type="dxa"/>
@@ -584,8 +596,8 @@
       </w:tblPr>
       <w:tblGrid>
         <w:gridCol w:w="1720"/>
-        <w:gridCol w:w="2244"/>
-        <w:gridCol w:w="908"/>
+        <w:gridCol w:w="1560"/>
+        <w:gridCol w:w="1200"/>
         <w:gridCol w:w="1200"/>
         <w:gridCol w:w="1200"/>
         <w:gridCol w:w="1920"/>
@@ -613,11 +625,12 @@
               <w:overflowPunct/>
               <w:autoSpaceDE/>
               <w:adjustRightInd/>
-              <w:spacing w:line="256" w:lineRule="auto"/>
-              <w:rPr>
-                <w:rFonts w:ascii="Arial" w:hAnsi="Arial" w:cs="Arial"/>
-                <w:b/>
-                <w:bCs/>
+              <w:spacing w:line="360" w:lineRule="auto"/>
+              <w:rPr>
+                <w:rFonts w:ascii="Arial" w:hAnsi="Arial" w:cs="Arial"/>
+                <w:b/>
+                <w:bCs/>
+                <w:color w:val="000000"/>
                 <w:kern w:val="2"/>
                 <w:lang w:val="es-PE" w:eastAsia="es-PE"/>
                 <w14:ligatures w14:val="standardContextual"/>
@@ -628,6 +641,7 @@
                 <w:rFonts w:ascii="Arial" w:hAnsi="Arial" w:cs="Arial"/>
                 <w:b/>
                 <w:bCs/>
+                <w:color w:val="000000" w:themeColor="text1"/>
                 <w:kern w:val="2"/>
                 <w:lang w:val="es-PE" w:eastAsia="es-PE"/>
                 <w14:ligatures w14:val="standardContextual"/>
@@ -638,7 +652,7 @@
         </w:tc>
         <w:tc>
           <w:tcPr>
-            <w:tcW w:w="2244" w:type="dxa"/>
+            <w:tcW w:w="1560" w:type="dxa"/>
             <w:tcBorders>
               <w:top w:val="single" w:sz="4" w:space="0" w:color="auto"/>
               <w:left w:val="nil"/>
@@ -654,9 +668,10 @@
               <w:overflowPunct/>
               <w:autoSpaceDE/>
               <w:adjustRightInd/>
-              <w:spacing w:line="256" w:lineRule="auto"/>
-              <w:rPr>
-                <w:rFonts w:ascii="Arial" w:hAnsi="Arial" w:cs="Arial"/>
+              <w:spacing w:line="360" w:lineRule="auto"/>
+              <w:rPr>
+                <w:rFonts w:ascii="Arial" w:hAnsi="Arial" w:cs="Arial"/>
+                <w:color w:val="000000"/>
                 <w:kern w:val="2"/>
                 <w:lang w:val="es-PE" w:eastAsia="es-PE"/>
                 <w14:ligatures w14:val="standardContextual"/>
@@ -665,26 +680,18 @@
             <w:r>
               <w:rPr>
                 <w:rFonts w:ascii="Arial" w:hAnsi="Arial" w:cs="Arial"/>
+                <w:color w:val="EE0000"/>
                 <w:kern w:val="2"/>
                 <w:lang w:val="es-PE" w:eastAsia="es-PE"/>
                 <w14:ligatures w14:val="standardContextual"/>
               </w:rPr>
               <w:t xml:space="preserve">{{FLARGA}}</w:t>
-            </w:r>
-            <w:r>
-              <w:rPr>
-                <w:rFonts w:ascii="Arial" w:hAnsi="Arial" w:cs="Arial"/>
-                <w:kern w:val="2"/>
-                <w:lang w:val="es-PE" w:eastAsia="es-PE"/>
-                <w14:ligatures w14:val="standardContextual"/>
-              </w:rPr>
-              <w:t xml:space="preserve"/>
             </w:r>
           </w:p>
         </w:tc>
         <w:tc>
           <w:tcPr>
-            <w:tcW w:w="767" w:type="dxa"/>
+            <w:tcW w:w="1200" w:type="dxa"/>
             <w:tcBorders>
               <w:top w:val="single" w:sz="4" w:space="0" w:color="auto"/>
               <w:left w:val="nil"/>
@@ -700,7 +707,7 @@
               <w:overflowPunct/>
               <w:autoSpaceDE/>
               <w:adjustRightInd/>
-              <w:spacing w:line="256" w:lineRule="auto"/>
+              <w:spacing w:line="360" w:lineRule="auto"/>
               <w:rPr>
                 <w:rFonts w:ascii="Arial" w:hAnsi="Arial" w:cs="Arial"/>
                 <w:b/>
@@ -743,7 +750,7 @@
               <w:overflowPunct/>
               <w:autoSpaceDE/>
               <w:adjustRightInd/>
-              <w:spacing w:line="256" w:lineRule="auto"/>
+              <w:spacing w:line="360" w:lineRule="auto"/>
               <w:rPr>
                 <w:rFonts w:ascii="Arial" w:hAnsi="Arial" w:cs="Arial"/>
                 <w:b/>
@@ -760,30 +767,6 @@
                 <w:b/>
                 <w:bCs/>
                 <w:color w:val="EE0000"/>
-                <w:kern w:val="2"/>
-                <w:lang w:val="es-PE" w:eastAsia="es-PE"/>
-                <w14:ligatures w14:val="standardContextual"/>
-              </w:rPr>
-              <w:t xml:space="preserve"/>
-            </w:r>
-            <w:r>
-              <w:rPr>
-                <w:rFonts w:ascii="Arial" w:hAnsi="Arial" w:cs="Arial"/>
-                <w:b/>
-                <w:bCs/>
-                <w:color w:val="000000" w:themeColor="text1"/>
-                <w:kern w:val="2"/>
-                <w:lang w:val="es-PE" w:eastAsia="es-PE"/>
-                <w14:ligatures w14:val="standardContextual"/>
-              </w:rPr>
-              <w:t xml:space="preserve"/>
-            </w:r>
-            <w:r>
-              <w:rPr>
-                <w:rFonts w:ascii="Arial" w:hAnsi="Arial" w:cs="Arial"/>
-                <w:b/>
-                <w:bCs/>
-                <w:color w:val="000000" w:themeColor="text1"/>
                 <w:kern w:val="2"/>
                 <w:lang w:val="es-PE" w:eastAsia="es-PE"/>
                 <w14:ligatures w14:val="standardContextual"/>
@@ -810,7 +793,7 @@
               <w:overflowPunct/>
               <w:autoSpaceDE/>
               <w:adjustRightInd/>
-              <w:spacing w:line="256" w:lineRule="auto"/>
+              <w:spacing w:line="360" w:lineRule="auto"/>
               <w:rPr>
                 <w:rFonts w:ascii="Arial" w:hAnsi="Arial" w:cs="Arial"/>
                 <w:b/>
@@ -853,7 +836,7 @@
               <w:overflowPunct/>
               <w:autoSpaceDE/>
               <w:adjustRightInd/>
-              <w:spacing w:line="256" w:lineRule="auto"/>
+              <w:spacing w:line="360" w:lineRule="auto"/>
               <w:jc w:val="center"/>
               <w:rPr>
                 <w:rFonts w:ascii="Arial" w:hAnsi="Arial" w:cs="Arial"/>
@@ -909,7 +892,7 @@
               <w:overflowPunct/>
               <w:autoSpaceDE/>
               <w:adjustRightInd/>
-              <w:spacing w:line="256" w:lineRule="auto"/>
+              <w:spacing w:line="360" w:lineRule="auto"/>
               <w:rPr>
                 <w:rFonts w:ascii="Arial" w:hAnsi="Arial" w:cs="Arial"/>
                 <w:b/>
@@ -936,7 +919,7 @@
         </w:tc>
         <w:tc>
           <w:tcPr>
-            <w:tcW w:w="7331" w:type="dxa"/>
+            <w:tcW w:w="7080" w:type="dxa"/>
             <w:gridSpan w:val="5"/>
             <w:tcBorders>
               <w:top w:val="single" w:sz="4" w:space="0" w:color="auto"/>
@@ -953,7 +936,7 @@
               <w:overflowPunct/>
               <w:autoSpaceDE/>
               <w:adjustRightInd/>
-              <w:spacing w:line="256" w:lineRule="auto"/>
+              <w:spacing w:line="360" w:lineRule="auto"/>
               <w:rPr>
                 <w:rFonts w:ascii="Arial" w:hAnsi="Arial" w:cs="Arial"/>
                 <w:color w:val="000000"/>
@@ -965,12 +948,42 @@
             <w:r>
               <w:rPr>
                 <w:rFonts w:ascii="Arial" w:hAnsi="Arial" w:cs="Arial"/>
-                <w:color w:val="000000"/>
+                <w:color w:val="EE0000"/>
                 <w:kern w:val="2"/>
                 <w:lang w:val="es-PE" w:eastAsia="es-PE"/>
                 <w14:ligatures w14:val="standardContextual"/>
               </w:rPr>
-              <w:t xml:space="preserve">{{SECTORTIPO}}</w:t>
+              <w:t xml:space="preserve">{{SECT}} </w:t>
+            </w:r>
+            <w:r>
+              <w:rPr>
+                <w:rFonts w:ascii="Arial" w:hAnsi="Arial" w:cs="Arial"/>
+                <w:color w:val="EE0000"/>
+                <w:kern w:val="2"/>
+                <w:lang w:val="es-PE" w:eastAsia="es-PE"/>
+                <w14:ligatures w14:val="standardContextual"/>
+              </w:rPr>
+              <w:t>–</w:t>
+            </w:r>
+            <w:r>
+              <w:rPr>
+                <w:rFonts w:ascii="Arial" w:hAnsi="Arial" w:cs="Arial"/>
+                <w:color w:val="EE0000"/>
+                <w:kern w:val="2"/>
+                <w:lang w:val="es-PE" w:eastAsia="es-PE"/>
+                <w14:ligatures w14:val="standardContextual"/>
+              </w:rPr>
+              <w:t xml:space="preserve"> {{TIPOTXT}}</w:t>
+            </w:r>
+            <w:r>
+              <w:rPr>
+                <w:rFonts w:ascii="Arial" w:hAnsi="Arial" w:cs="Arial"/>
+                <w:color w:val="EE0000"/>
+                <w:kern w:val="2"/>
+                <w:lang w:val="es-PE" w:eastAsia="es-PE"/>
+                <w14:ligatures w14:val="standardContextual"/>
+              </w:rPr>
+              <w:t xml:space="preserve"/>
             </w:r>
           </w:p>
         </w:tc>
@@ -998,7 +1011,7 @@
               <w:overflowPunct/>
               <w:autoSpaceDE/>
               <w:adjustRightInd/>
-              <w:spacing w:line="256" w:lineRule="auto"/>
+              <w:spacing w:line="360" w:lineRule="auto"/>
               <w:rPr>
                 <w:rFonts w:ascii="Arial" w:hAnsi="Arial" w:cs="Arial"/>
                 <w:b/>
@@ -1025,7 +1038,7 @@
         </w:tc>
         <w:tc>
           <w:tcPr>
-            <w:tcW w:w="7331" w:type="dxa"/>
+            <w:tcW w:w="7080" w:type="dxa"/>
             <w:gridSpan w:val="5"/>
             <w:tcBorders>
               <w:top w:val="single" w:sz="4" w:space="0" w:color="auto"/>
@@ -1042,7 +1055,7 @@
               <w:overflowPunct/>
               <w:autoSpaceDE/>
               <w:adjustRightInd/>
-              <w:spacing w:line="256" w:lineRule="auto"/>
+              <w:spacing w:line="360" w:lineRule="auto"/>
               <w:rPr>
                 <w:rFonts w:ascii="Arial" w:hAnsi="Arial" w:cs="Arial"/>
                 <w:color w:val="000000"/>
@@ -1054,7 +1067,7 @@
             <w:r>
               <w:rPr>
                 <w:rFonts w:ascii="Arial" w:hAnsi="Arial" w:cs="Arial"/>
-                <w:color w:val="000000"/>
+                <w:color w:val="EE0000"/>
                 <w:kern w:val="2"/>
                 <w:lang w:val="es-PE" w:eastAsia="es-PE"/>
                 <w14:ligatures w14:val="standardContextual"/>
@@ -1071,7 +1084,7 @@
         </w:trPr>
         <w:tc>
           <w:tcPr>
-            <w:tcW w:w="9051" w:type="dxa"/>
+            <w:tcW w:w="8800" w:type="dxa"/>
             <w:gridSpan w:val="6"/>
             <w:tcBorders>
               <w:top w:val="single" w:sz="4" w:space="0" w:color="auto"/>
@@ -1089,7 +1102,7 @@
               <w:overflowPunct/>
               <w:autoSpaceDE/>
               <w:adjustRightInd/>
-              <w:spacing w:line="256" w:lineRule="auto"/>
+              <w:spacing w:line="360" w:lineRule="auto"/>
               <w:jc w:val="center"/>
               <w:rPr>
                 <w:rFonts w:ascii="Arial" w:hAnsi="Arial" w:cs="Arial"/>
@@ -1100,6 +1113,7 @@
                 <w14:ligatures w14:val="standardContextual"/>
               </w:rPr>
             </w:pPr>
+            <w:proofErr w:type="gramStart"/>
             <w:r>
               <w:rPr>
                 <w:rFonts w:ascii="Arial" w:hAnsi="Arial" w:cs="Arial"/>
@@ -1109,8 +1123,9 @@
                 <w:lang w:val="es-PE" w:eastAsia="es-PE"/>
                 <w14:ligatures w14:val="standardContextual"/>
               </w:rPr>
-              <w:t>Total,</w:t>
+              <w:t>Total</w:t>
             </w:r>
+            <w:proofErr w:type="gramEnd"/>
             <w:r>
               <w:rPr>
                 <w:rFonts w:ascii="Arial" w:hAnsi="Arial" w:cs="Arial"/>
@@ -1127,6 +1142,7 @@
                 <w:rFonts w:ascii="Arial" w:hAnsi="Arial" w:cs="Arial"/>
                 <w:b/>
                 <w:bCs/>
+                <w:color w:val="EE0000"/>
                 <w:kern w:val="2"/>
                 <w:lang w:val="es-PE" w:eastAsia="es-PE"/>
                 <w14:ligatures w14:val="standardContextual"/>
@@ -1159,7 +1175,7 @@
               <w:overflowPunct/>
               <w:autoSpaceDE/>
               <w:adjustRightInd/>
-              <w:spacing w:line="256" w:lineRule="auto"/>
+              <w:spacing w:line="360" w:lineRule="auto"/>
               <w:rPr>
                 <w:rFonts w:ascii="Arial" w:hAnsi="Arial" w:cs="Arial"/>
                 <w:b/>
@@ -1186,7 +1202,7 @@
         </w:tc>
         <w:tc>
           <w:tcPr>
-            <w:tcW w:w="3011" w:type="dxa"/>
+            <w:tcW w:w="2760" w:type="dxa"/>
             <w:gridSpan w:val="2"/>
             <w:tcBorders>
               <w:top w:val="single" w:sz="4" w:space="0" w:color="auto"/>
@@ -1203,7 +1219,7 @@
               <w:overflowPunct/>
               <w:autoSpaceDE/>
               <w:adjustRightInd/>
-              <w:spacing w:line="256" w:lineRule="auto"/>
+              <w:spacing w:line="360" w:lineRule="auto"/>
               <w:jc w:val="center"/>
               <w:rPr>
                 <w:rFonts w:ascii="Arial" w:hAnsi="Arial" w:cs="Arial"/>
@@ -1220,7 +1236,7 @@
                 <w:rFonts w:ascii="Arial" w:hAnsi="Arial" w:cs="Arial"/>
                 <w:b/>
                 <w:bCs/>
-                <w:color w:val="000000"/>
+                <w:color w:val="EE0000"/>
                 <w:kern w:val="2"/>
                 <w:lang w:val="es-PE" w:eastAsia="es-PE"/>
                 <w14:ligatures w14:val="standardContextual"/>
@@ -1247,7 +1263,7 @@
               <w:overflowPunct/>
               <w:autoSpaceDE/>
               <w:adjustRightInd/>
-              <w:spacing w:line="256" w:lineRule="auto"/>
+              <w:spacing w:line="360" w:lineRule="auto"/>
               <w:rPr>
                 <w:rFonts w:ascii="Arial" w:hAnsi="Arial" w:cs="Arial"/>
                 <w:b/>
@@ -1291,7 +1307,7 @@
               <w:overflowPunct/>
               <w:autoSpaceDE/>
               <w:adjustRightInd/>
-              <w:spacing w:line="256" w:lineRule="auto"/>
+              <w:spacing w:line="360" w:lineRule="auto"/>
               <w:jc w:val="center"/>
               <w:rPr>
                 <w:rFonts w:ascii="Arial" w:hAnsi="Arial" w:cs="Arial"/>
@@ -1308,22 +1324,12 @@
                 <w:rFonts w:ascii="Arial" w:hAnsi="Arial" w:cs="Arial"/>
                 <w:b/>
                 <w:bCs/>
+                <w:color w:val="EE0000"/>
                 <w:kern w:val="2"/>
                 <w:lang w:val="es-PE" w:eastAsia="es-PE"/>
                 <w14:ligatures w14:val="standardContextual"/>
               </w:rPr>
               <w:t xml:space="preserve">{{M}}</w:t>
-            </w:r>
-            <w:r>
-              <w:rPr>
-                <w:rFonts w:ascii="Arial" w:hAnsi="Arial" w:cs="Arial"/>
-                <w:b/>
-                <w:bCs/>
-                <w:kern w:val="2"/>
-                <w:lang w:val="es-PE" w:eastAsia="es-PE"/>
-                <w14:ligatures w14:val="standardContextual"/>
-              </w:rPr>
-              <w:t xml:space="preserve"/>
             </w:r>
           </w:p>
         </w:tc>
@@ -1331,6 +1337,7 @@
     </w:tbl>
     <w:p>
       <w:pPr>
+        <w:spacing w:line="360" w:lineRule="auto"/>
         <w:ind w:left="708"/>
         <w:rPr>
           <w:rFonts w:ascii="Arial" w:hAnsi="Arial" w:cs="Arial"/>
@@ -1339,6 +1346,7 @@
     </w:p>
     <w:p>
       <w:pPr>
+        <w:spacing w:line="360" w:lineRule="auto"/>
         <w:ind w:left="708"/>
         <w:rPr>
           <w:rFonts w:ascii="Arial" w:hAnsi="Arial" w:cs="Arial"/>
@@ -1347,6 +1355,7 @@
     </w:p>
     <w:p>
       <w:pPr>
+        <w:spacing w:line="360" w:lineRule="auto"/>
         <w:ind w:right="-518"/>
         <w:jc w:val="both"/>
         <w:rPr>
@@ -1368,16 +1377,21 @@
     </w:p>
     <w:p>
       <w:pPr>
+        <w:spacing w:line="360" w:lineRule="auto"/>
         <w:ind w:right="-518"/>
         <w:jc w:val="both"/>
         <w:rPr>
           <w:rFonts w:ascii="Arial" w:hAnsi="Arial" w:cs="Arial"/>
+          <w:b/>
+          <w:bCs/>
+          <w:u w:val="single"/>
         </w:rPr>
       </w:pPr>
     </w:p>
     <w:tbl>
       <w:tblPr>
-        <w:tblW w:w="8740" w:type="dxa"/>
+        <w:tblW w:w="8789" w:type="dxa"/>
+        <w:tblInd w:w="-147" w:type="dxa"/>
         <w:tblCellMar>
           <w:left w:w="70" w:type="dxa"/>
           <w:right w:w="70" w:type="dxa"/>
@@ -1385,19 +1399,19 @@
         <w:tblLook w:val="04A0" w:firstRow="1" w:lastRow="0" w:firstColumn="1" w:lastColumn="0" w:noHBand="0" w:noVBand="1"/>
       </w:tblPr>
       <w:tblGrid>
-        <w:gridCol w:w="3720"/>
-        <w:gridCol w:w="1420"/>
-        <w:gridCol w:w="1200"/>
-        <w:gridCol w:w="1200"/>
-        <w:gridCol w:w="1200"/>
+        <w:gridCol w:w="3970"/>
+        <w:gridCol w:w="1417"/>
+        <w:gridCol w:w="1134"/>
+        <w:gridCol w:w="1134"/>
+        <w:gridCol w:w="1134"/>
       </w:tblGrid>
       <w:tr>
         <w:trPr>
-          <w:trHeight w:val="225"/>
+          <w:trHeight w:val="300"/>
         </w:trPr>
         <w:tc>
           <w:tcPr>
-            <w:tcW w:w="3720" w:type="dxa"/>
+            <w:tcW w:w="3970" w:type="dxa"/>
             <w:tcBorders>
               <w:top w:val="single" w:sz="4" w:space="0" w:color="auto"/>
               <w:left w:val="single" w:sz="4" w:space="0" w:color="auto"/>
@@ -1405,6 +1419,7 @@
               <w:right w:val="single" w:sz="4" w:space="0" w:color="auto"/>
             </w:tcBorders>
             <w:shd w:val="clear" w:color="000000" w:fill="D9D9D9"/>
+            <w:noWrap/>
             <w:vAlign w:val="center"/>
             <w:hideMark/>
           </w:tcPr>
@@ -1414,26 +1429,23 @@
               <w:autoSpaceDE/>
               <w:autoSpaceDN/>
               <w:adjustRightInd/>
+              <w:spacing w:line="360" w:lineRule="auto"/>
               <w:jc w:val="center"/>
               <w:textAlignment w:val="auto"/>
               <w:rPr>
-                <w:rFonts w:ascii="Segoe UI" w:hAnsi="Segoe UI" w:cs="Segoe UI"/>
-                <w:b/>
-                <w:bCs/>
-                <w:color w:val="1A2340"/>
-                <w:sz w:val="16"/>
-                <w:szCs w:val="16"/>
+                <w:rFonts w:ascii="Arial" w:hAnsi="Arial" w:cs="Arial"/>
+                <w:b/>
+                <w:bCs/>
+                <w:color w:val="000000"/>
                 <w:lang w:val="es-PE" w:eastAsia="es-PE"/>
               </w:rPr>
             </w:pPr>
             <w:r>
               <w:rPr>
-                <w:rFonts w:ascii="Segoe UI" w:hAnsi="Segoe UI" w:cs="Segoe UI"/>
-                <w:b/>
-                <w:bCs/>
-                <w:color w:val="1A2340"/>
-                <w:sz w:val="16"/>
-                <w:szCs w:val="16"/>
+                <w:rFonts w:ascii="Arial" w:hAnsi="Arial" w:cs="Arial"/>
+                <w:b/>
+                <w:bCs/>
+                <w:color w:val="000000"/>
                 <w:lang w:val="es-PE" w:eastAsia="es-PE"/>
               </w:rPr>
               <w:t>SECCIÓN</w:t>
@@ -1442,7 +1454,7 @@
         </w:tc>
         <w:tc>
           <w:tcPr>
-            <w:tcW w:w="1420" w:type="dxa"/>
+            <w:tcW w:w="1417" w:type="dxa"/>
             <w:tcBorders>
               <w:top w:val="single" w:sz="4" w:space="0" w:color="auto"/>
               <w:left w:val="nil"/>
@@ -1450,6 +1462,7 @@
               <w:right w:val="single" w:sz="4" w:space="0" w:color="auto"/>
             </w:tcBorders>
             <w:shd w:val="clear" w:color="000000" w:fill="D9D9D9"/>
+            <w:noWrap/>
             <w:vAlign w:val="center"/>
             <w:hideMark/>
           </w:tcPr>
@@ -1459,26 +1472,23 @@
               <w:autoSpaceDE/>
               <w:autoSpaceDN/>
               <w:adjustRightInd/>
+              <w:spacing w:line="360" w:lineRule="auto"/>
               <w:jc w:val="center"/>
               <w:textAlignment w:val="auto"/>
               <w:rPr>
-                <w:rFonts w:ascii="Segoe UI" w:hAnsi="Segoe UI" w:cs="Segoe UI"/>
-                <w:b/>
-                <w:bCs/>
-                <w:color w:val="1A2340"/>
-                <w:sz w:val="16"/>
-                <w:szCs w:val="16"/>
+                <w:rFonts w:ascii="Arial" w:hAnsi="Arial" w:cs="Arial"/>
+                <w:b/>
+                <w:bCs/>
+                <w:color w:val="000000"/>
                 <w:lang w:val="es-PE" w:eastAsia="es-PE"/>
               </w:rPr>
             </w:pPr>
             <w:r>
               <w:rPr>
-                <w:rFonts w:ascii="Segoe UI" w:hAnsi="Segoe UI" w:cs="Segoe UI"/>
-                <w:b/>
-                <w:bCs/>
-                <w:color w:val="1A2340"/>
-                <w:sz w:val="16"/>
-                <w:szCs w:val="16"/>
+                <w:rFonts w:ascii="Arial" w:hAnsi="Arial" w:cs="Arial"/>
+                <w:b/>
+                <w:bCs/>
+                <w:color w:val="000000"/>
                 <w:lang w:val="es-PE" w:eastAsia="es-PE"/>
               </w:rPr>
               <w:t>RESULTADO</w:t>
@@ -1487,14 +1497,15 @@
         </w:tc>
         <w:tc>
           <w:tcPr>
-            <w:tcW w:w="1200" w:type="dxa"/>
+            <w:tcW w:w="1134" w:type="dxa"/>
             <w:tcBorders>
               <w:top w:val="single" w:sz="4" w:space="0" w:color="auto"/>
               <w:left w:val="nil"/>
               <w:bottom w:val="single" w:sz="4" w:space="0" w:color="auto"/>
               <w:right w:val="single" w:sz="4" w:space="0" w:color="auto"/>
             </w:tcBorders>
-            <w:shd w:val="clear" w:color="000000" w:fill="E00000"/>
+            <w:shd w:val="clear" w:color="000000" w:fill="FF0000"/>
+            <w:noWrap/>
             <w:vAlign w:val="center"/>
             <w:hideMark/>
           </w:tcPr>
@@ -1504,26 +1515,23 @@
               <w:autoSpaceDE/>
               <w:autoSpaceDN/>
               <w:adjustRightInd/>
+              <w:spacing w:line="360" w:lineRule="auto"/>
               <w:jc w:val="center"/>
               <w:textAlignment w:val="auto"/>
               <w:rPr>
-                <w:rFonts w:ascii="Segoe UI" w:hAnsi="Segoe UI" w:cs="Segoe UI"/>
-                <w:b/>
-                <w:bCs/>
-                <w:color w:val="FFFFFF"/>
-                <w:sz w:val="16"/>
-                <w:szCs w:val="16"/>
+                <w:rFonts w:ascii="Arial" w:hAnsi="Arial" w:cs="Arial"/>
+                <w:b/>
+                <w:bCs/>
+                <w:color w:val="000000"/>
                 <w:lang w:val="es-PE" w:eastAsia="es-PE"/>
               </w:rPr>
             </w:pPr>
             <w:r>
               <w:rPr>
-                <w:rFonts w:ascii="Segoe UI" w:hAnsi="Segoe UI" w:cs="Segoe UI"/>
-                <w:b/>
-                <w:bCs/>
-                <w:color w:val="FFFFFF"/>
-                <w:sz w:val="16"/>
-                <w:szCs w:val="16"/>
+                <w:rFonts w:ascii="Arial" w:hAnsi="Arial" w:cs="Arial"/>
+                <w:b/>
+                <w:bCs/>
+                <w:color w:val="000000"/>
                 <w:lang w:val="es-PE" w:eastAsia="es-PE"/>
               </w:rPr>
               <w:t>ROJO</w:t>
@@ -1532,14 +1540,15 @@
         </w:tc>
         <w:tc>
           <w:tcPr>
-            <w:tcW w:w="1200" w:type="dxa"/>
+            <w:tcW w:w="1134" w:type="dxa"/>
             <w:tcBorders>
               <w:top w:val="single" w:sz="4" w:space="0" w:color="auto"/>
               <w:left w:val="nil"/>
               <w:bottom w:val="single" w:sz="4" w:space="0" w:color="auto"/>
               <w:right w:val="single" w:sz="4" w:space="0" w:color="auto"/>
             </w:tcBorders>
-            <w:shd w:val="clear" w:color="000000" w:fill="1F9D44"/>
+            <w:shd w:val="clear" w:color="000000" w:fill="00B050"/>
+            <w:noWrap/>
             <w:vAlign w:val="center"/>
             <w:hideMark/>
           </w:tcPr>
@@ -1549,26 +1558,23 @@
               <w:autoSpaceDE/>
               <w:autoSpaceDN/>
               <w:adjustRightInd/>
+              <w:spacing w:line="360" w:lineRule="auto"/>
               <w:jc w:val="center"/>
               <w:textAlignment w:val="auto"/>
               <w:rPr>
-                <w:rFonts w:ascii="Segoe UI" w:hAnsi="Segoe UI" w:cs="Segoe UI"/>
-                <w:b/>
-                <w:bCs/>
-                <w:color w:val="FFFFFF"/>
-                <w:sz w:val="16"/>
-                <w:szCs w:val="16"/>
+                <w:rFonts w:ascii="Arial" w:hAnsi="Arial" w:cs="Arial"/>
+                <w:b/>
+                <w:bCs/>
+                <w:color w:val="000000"/>
                 <w:lang w:val="es-PE" w:eastAsia="es-PE"/>
               </w:rPr>
             </w:pPr>
             <w:r>
               <w:rPr>
-                <w:rFonts w:ascii="Segoe UI" w:hAnsi="Segoe UI" w:cs="Segoe UI"/>
-                <w:b/>
-                <w:bCs/>
-                <w:color w:val="FFFFFF"/>
-                <w:sz w:val="16"/>
-                <w:szCs w:val="16"/>
+                <w:rFonts w:ascii="Arial" w:hAnsi="Arial" w:cs="Arial"/>
+                <w:b/>
+                <w:bCs/>
+                <w:color w:val="000000"/>
                 <w:lang w:val="es-PE" w:eastAsia="es-PE"/>
               </w:rPr>
               <w:t>VERDE</w:t>
@@ -1577,7 +1583,7 @@
         </w:tc>
         <w:tc>
           <w:tcPr>
-            <w:tcW w:w="1200" w:type="dxa"/>
+            <w:tcW w:w="1134" w:type="dxa"/>
             <w:tcBorders>
               <w:top w:val="single" w:sz="4" w:space="0" w:color="auto"/>
               <w:left w:val="nil"/>
@@ -1585,6 +1591,7 @@
               <w:right w:val="single" w:sz="4" w:space="0" w:color="auto"/>
             </w:tcBorders>
             <w:shd w:val="clear" w:color="000000" w:fill="FFFF00"/>
+            <w:noWrap/>
             <w:vAlign w:val="center"/>
             <w:hideMark/>
           </w:tcPr>
@@ -1594,26 +1601,23 @@
               <w:autoSpaceDE/>
               <w:autoSpaceDN/>
               <w:adjustRightInd/>
+              <w:spacing w:line="360" w:lineRule="auto"/>
               <w:jc w:val="center"/>
               <w:textAlignment w:val="auto"/>
               <w:rPr>
-                <w:rFonts w:ascii="Segoe UI" w:hAnsi="Segoe UI" w:cs="Segoe UI"/>
-                <w:b/>
-                <w:bCs/>
-                <w:color w:val="1A2340"/>
-                <w:sz w:val="16"/>
-                <w:szCs w:val="16"/>
+                <w:rFonts w:ascii="Arial" w:hAnsi="Arial" w:cs="Arial"/>
+                <w:b/>
+                <w:bCs/>
+                <w:color w:val="000000"/>
                 <w:lang w:val="es-PE" w:eastAsia="es-PE"/>
               </w:rPr>
             </w:pPr>
             <w:r>
               <w:rPr>
-                <w:rFonts w:ascii="Segoe UI" w:hAnsi="Segoe UI" w:cs="Segoe UI"/>
-                <w:b/>
-                <w:bCs/>
-                <w:color w:val="1A2340"/>
-                <w:sz w:val="16"/>
-                <w:szCs w:val="16"/>
+                <w:rFonts w:ascii="Arial" w:hAnsi="Arial" w:cs="Arial"/>
+                <w:b/>
+                <w:bCs/>
+                <w:color w:val="000000"/>
                 <w:lang w:val="es-PE" w:eastAsia="es-PE"/>
               </w:rPr>
               <w:t>%R</w:t>
@@ -1623,11 +1627,11 @@
       </w:tr>
       <w:tr>
         <w:trPr>
-          <w:trHeight w:val="225"/>
+          <w:trHeight w:val="300"/>
         </w:trPr>
         <w:tc>
           <w:tcPr>
-            <w:tcW w:w="3720" w:type="dxa"/>
+            <w:tcW w:w="3970" w:type="dxa"/>
             <w:tcBorders>
               <w:top w:val="nil"/>
               <w:left w:val="single" w:sz="4" w:space="0" w:color="auto"/>
@@ -1635,6 +1639,7 @@
               <w:right w:val="single" w:sz="4" w:space="0" w:color="auto"/>
             </w:tcBorders>
             <w:shd w:val="clear" w:color="000000" w:fill="F2F2F2"/>
+            <w:noWrap/>
             <w:vAlign w:val="center"/>
             <w:hideMark/>
           </w:tcPr>
@@ -1644,25 +1649,16 @@
               <w:autoSpaceDE/>
               <w:autoSpaceDN/>
               <w:adjustRightInd/>
+              <w:spacing w:line="360" w:lineRule="auto"/>
               <w:textAlignment w:val="auto"/>
               <w:rPr>
-                <w:rFonts w:ascii="Segoe UI" w:hAnsi="Segoe UI" w:cs="Segoe UI"/>
-                <w:b/>
-                <w:bCs/>
-                <w:color w:val="1A2340"/>
-                <w:sz w:val="16"/>
-                <w:szCs w:val="16"/>
+                <w:rFonts w:ascii="Arial" w:hAnsi="Arial" w:cs="Arial"/>
                 <w:lang w:val="es-PE" w:eastAsia="es-PE"/>
               </w:rPr>
             </w:pPr>
             <w:r>
               <w:rPr>
-                <w:rFonts w:ascii="Segoe UI" w:hAnsi="Segoe UI" w:cs="Segoe UI"/>
-                <w:b/>
-                <w:bCs/>
-                <w:color w:val="1A2340"/>
-                <w:sz w:val="16"/>
-                <w:szCs w:val="16"/>
+                <w:rFonts w:ascii="Arial" w:hAnsi="Arial" w:cs="Arial"/>
                 <w:lang w:val="es-PE" w:eastAsia="es-PE"/>
               </w:rPr>
               <w:t xml:space="preserve">{{SN}}</w:t>
@@ -1671,14 +1667,15 @@
         </w:tc>
         <w:tc>
           <w:tcPr>
-            <w:tcW w:w="1420" w:type="dxa"/>
+            <w:tcW w:w="1417" w:type="dxa"/>
             <w:tcBorders>
               <w:top w:val="nil"/>
               <w:left w:val="nil"/>
               <w:bottom w:val="single" w:sz="4" w:space="0" w:color="auto"/>
               <w:right w:val="single" w:sz="4" w:space="0" w:color="auto"/>
             </w:tcBorders>
-            <w:shd w:val="clear" w:color="000000" w:fill="{{SFILL}}"/>
+            <w:shd w:val="clear" w:color="auto" w:fill="{{SFILL}}"/>
+            <w:noWrap/>
             <w:vAlign w:val="center"/>
             <w:hideMark/>
           </w:tcPr>
@@ -1688,26 +1685,19 @@
               <w:autoSpaceDE/>
               <w:autoSpaceDN/>
               <w:adjustRightInd/>
+              <w:spacing w:line="360" w:lineRule="auto"/>
               <w:jc w:val="center"/>
               <w:textAlignment w:val="auto"/>
               <w:rPr>
-                <w:rFonts w:ascii="Segoe UI" w:hAnsi="Segoe UI" w:cs="Segoe UI"/>
-                <w:b/>
-                <w:bCs/>
-                <w:color w:val="FFFFFF"/>
-                <w:sz w:val="16"/>
-                <w:szCs w:val="16"/>
+                <w:rFonts w:ascii="Arial" w:hAnsi="Arial" w:cs="Arial"/>
+                <w:color w:val="000000"/>
                 <w:lang w:val="es-PE" w:eastAsia="es-PE"/>
               </w:rPr>
             </w:pPr>
             <w:r>
               <w:rPr>
-                <w:rFonts w:ascii="Segoe UI" w:hAnsi="Segoe UI" w:cs="Segoe UI"/>
-                <w:b/>
-                <w:bCs/>
-                <w:color w:val="FFFFFF"/>
-                <w:sz w:val="16"/>
-                <w:szCs w:val="16"/>
+                <w:rFonts w:ascii="Arial" w:hAnsi="Arial" w:cs="Arial"/>
+                <w:color w:val="000000"/>
                 <w:lang w:val="es-PE" w:eastAsia="es-PE"/>
               </w:rPr>
               <w:t xml:space="preserve">{{SV}}</w:t>
@@ -1716,14 +1706,14 @@
         </w:tc>
         <w:tc>
           <w:tcPr>
-            <w:tcW w:w="1200" w:type="dxa"/>
+            <w:tcW w:w="1134" w:type="dxa"/>
             <w:tcBorders>
               <w:top w:val="nil"/>
               <w:left w:val="nil"/>
               <w:bottom w:val="single" w:sz="4" w:space="0" w:color="auto"/>
               <w:right w:val="single" w:sz="4" w:space="0" w:color="auto"/>
             </w:tcBorders>
-            <w:shd w:val="clear" w:color="000000" w:fill="F2F5FB"/>
+            <w:noWrap/>
             <w:vAlign w:val="center"/>
             <w:hideMark/>
           </w:tcPr>
@@ -1733,22 +1723,19 @@
               <w:autoSpaceDE/>
               <w:autoSpaceDN/>
               <w:adjustRightInd/>
+              <w:spacing w:line="360" w:lineRule="auto"/>
               <w:jc w:val="center"/>
               <w:textAlignment w:val="auto"/>
               <w:rPr>
-                <w:rFonts w:ascii="Segoe UI" w:hAnsi="Segoe UI" w:cs="Segoe UI"/>
-                <w:color w:val="1A2340"/>
-                <w:sz w:val="16"/>
-                <w:szCs w:val="16"/>
+                <w:rFonts w:ascii="Arial" w:hAnsi="Arial" w:cs="Arial"/>
+                <w:color w:val="000000"/>
                 <w:lang w:val="es-PE" w:eastAsia="es-PE"/>
               </w:rPr>
             </w:pPr>
             <w:r>
               <w:rPr>
-                <w:rFonts w:ascii="Segoe UI" w:hAnsi="Segoe UI" w:cs="Segoe UI"/>
-                <w:color w:val="1A2340"/>
-                <w:sz w:val="16"/>
-                <w:szCs w:val="16"/>
+                <w:rFonts w:ascii="Arial" w:hAnsi="Arial" w:cs="Arial"/>
+                <w:color w:val="000000"/>
                 <w:lang w:val="es-PE" w:eastAsia="es-PE"/>
               </w:rPr>
               <w:t xml:space="preserve">{{SR}}</w:t>
@@ -1757,14 +1744,15 @@
         </w:tc>
         <w:tc>
           <w:tcPr>
-            <w:tcW w:w="1200" w:type="dxa"/>
+            <w:tcW w:w="1134" w:type="dxa"/>
             <w:tcBorders>
               <w:top w:val="nil"/>
               <w:left w:val="nil"/>
               <w:bottom w:val="single" w:sz="4" w:space="0" w:color="auto"/>
               <w:right w:val="single" w:sz="4" w:space="0" w:color="auto"/>
             </w:tcBorders>
-            <w:shd w:val="clear" w:color="000000" w:fill="F2F5FB"/>
+            <w:shd w:val="clear" w:color="000000" w:fill="F2F2F2"/>
+            <w:noWrap/>
             <w:vAlign w:val="center"/>
             <w:hideMark/>
           </w:tcPr>
@@ -1774,22 +1762,19 @@
               <w:autoSpaceDE/>
               <w:autoSpaceDN/>
               <w:adjustRightInd/>
+              <w:spacing w:line="360" w:lineRule="auto"/>
               <w:jc w:val="center"/>
               <w:textAlignment w:val="auto"/>
               <w:rPr>
-                <w:rFonts w:ascii="Segoe UI" w:hAnsi="Segoe UI" w:cs="Segoe UI"/>
-                <w:color w:val="1A2340"/>
-                <w:sz w:val="16"/>
-                <w:szCs w:val="16"/>
+                <w:rFonts w:ascii="Arial" w:hAnsi="Arial" w:cs="Arial"/>
+                <w:color w:val="000000"/>
                 <w:lang w:val="es-PE" w:eastAsia="es-PE"/>
               </w:rPr>
             </w:pPr>
             <w:r>
               <w:rPr>
-                <w:rFonts w:ascii="Segoe UI" w:hAnsi="Segoe UI" w:cs="Segoe UI"/>
-                <w:color w:val="1A2340"/>
-                <w:sz w:val="16"/>
-                <w:szCs w:val="16"/>
+                <w:rFonts w:ascii="Arial" w:hAnsi="Arial" w:cs="Arial"/>
+                <w:color w:val="000000"/>
                 <w:lang w:val="es-PE" w:eastAsia="es-PE"/>
               </w:rPr>
               <w:t xml:space="preserve">{{SG}}</w:t>
@@ -1798,14 +1783,14 @@
         </w:tc>
         <w:tc>
           <w:tcPr>
-            <w:tcW w:w="1200" w:type="dxa"/>
+            <w:tcW w:w="1134" w:type="dxa"/>
             <w:tcBorders>
               <w:top w:val="nil"/>
               <w:left w:val="nil"/>
               <w:bottom w:val="single" w:sz="4" w:space="0" w:color="auto"/>
               <w:right w:val="single" w:sz="4" w:space="0" w:color="auto"/>
             </w:tcBorders>
-            <w:shd w:val="clear" w:color="000000" w:fill="F2F5FB"/>
+            <w:noWrap/>
             <w:vAlign w:val="center"/>
             <w:hideMark/>
           </w:tcPr>
@@ -1815,26 +1800,19 @@
               <w:autoSpaceDE/>
               <w:autoSpaceDN/>
               <w:adjustRightInd/>
+              <w:spacing w:line="360" w:lineRule="auto"/>
               <w:jc w:val="center"/>
               <w:textAlignment w:val="auto"/>
               <w:rPr>
-                <w:rFonts w:ascii="Segoe UI" w:hAnsi="Segoe UI" w:cs="Segoe UI"/>
-                <w:b/>
-                <w:bCs/>
-                <w:color w:val="1A2340"/>
-                <w:sz w:val="16"/>
-                <w:szCs w:val="16"/>
+                <w:rFonts w:ascii="Arial" w:hAnsi="Arial" w:cs="Arial"/>
+                <w:color w:val="000000"/>
                 <w:lang w:val="es-PE" w:eastAsia="es-PE"/>
               </w:rPr>
             </w:pPr>
             <w:r>
               <w:rPr>
-                <w:rFonts w:ascii="Segoe UI" w:hAnsi="Segoe UI" w:cs="Segoe UI"/>
-                <w:b/>
-                <w:bCs/>
-                <w:color w:val="1A2340"/>
-                <w:sz w:val="16"/>
-                <w:szCs w:val="16"/>
+                <w:rFonts w:ascii="Arial" w:hAnsi="Arial" w:cs="Arial"/>
+                <w:color w:val="000000"/>
                 <w:lang w:val="es-PE" w:eastAsia="es-PE"/>
               </w:rPr>
               <w:t xml:space="preserve">{{SP}}</w:t>
@@ -1844,18 +1822,19 @@
       </w:tr>
       <w:tr>
         <w:trPr>
-          <w:trHeight w:val="225"/>
+          <w:trHeight w:val="345"/>
         </w:trPr>
         <w:tc>
           <w:tcPr>
-            <w:tcW w:w="3720" w:type="dxa"/>
+            <w:tcW w:w="3970" w:type="dxa"/>
             <w:tcBorders>
               <w:top w:val="nil"/>
               <w:left w:val="single" w:sz="4" w:space="0" w:color="auto"/>
               <w:bottom w:val="single" w:sz="4" w:space="0" w:color="auto"/>
               <w:right w:val="single" w:sz="4" w:space="0" w:color="auto"/>
             </w:tcBorders>
-            <w:shd w:val="clear" w:color="000000" w:fill="C9C9C9"/>
+            <w:shd w:val="clear" w:color="000000" w:fill="D9D9D9"/>
+            <w:noWrap/>
             <w:vAlign w:val="center"/>
             <w:hideMark/>
           </w:tcPr>
@@ -1865,25 +1844,22 @@
               <w:autoSpaceDE/>
               <w:autoSpaceDN/>
               <w:adjustRightInd/>
+              <w:spacing w:line="360" w:lineRule="auto"/>
               <w:textAlignment w:val="auto"/>
               <w:rPr>
-                <w:rFonts w:ascii="Segoe UI" w:hAnsi="Segoe UI" w:cs="Segoe UI"/>
-                <w:b/>
-                <w:bCs/>
-                <w:color w:val="1A2340"/>
-                <w:sz w:val="16"/>
-                <w:szCs w:val="16"/>
+                <w:rFonts w:ascii="Arial" w:hAnsi="Arial" w:cs="Arial"/>
+                <w:b/>
+                <w:bCs/>
+                <w:color w:val="000000"/>
                 <w:lang w:val="es-PE" w:eastAsia="es-PE"/>
               </w:rPr>
             </w:pPr>
             <w:r>
               <w:rPr>
-                <w:rFonts w:ascii="Segoe UI" w:hAnsi="Segoe UI" w:cs="Segoe UI"/>
-                <w:b/>
-                <w:bCs/>
-                <w:color w:val="1A2340"/>
-                <w:sz w:val="16"/>
-                <w:szCs w:val="16"/>
+                <w:rFonts w:ascii="Arial" w:hAnsi="Arial" w:cs="Arial"/>
+                <w:b/>
+                <w:bCs/>
+                <w:color w:val="000000"/>
                 <w:lang w:val="es-PE" w:eastAsia="es-PE"/>
               </w:rPr>
               <w:t xml:space="preserve">GENERAL DEL GRUPO</w:t>
@@ -1892,14 +1868,15 @@
         </w:tc>
         <w:tc>
           <w:tcPr>
-            <w:tcW w:w="1420" w:type="dxa"/>
+            <w:tcW w:w="1417" w:type="dxa"/>
             <w:tcBorders>
-              <w:top w:val="nil"/>
-              <w:left w:val="nil"/>
-              <w:bottom w:val="single" w:sz="4" w:space="0" w:color="auto"/>
-              <w:right w:val="single" w:sz="4" w:space="0" w:color="auto"/>
+              <w:top w:val="single" w:sz="4" w:space="0" w:color="C8C8C8"/>
+              <w:left w:val="single" w:sz="4" w:space="0" w:color="C8C8C8"/>
+              <w:bottom w:val="single" w:sz="4" w:space="0" w:color="C8C8C8"/>
+              <w:right w:val="single" w:sz="4" w:space="0" w:color="C8C8C8"/>
             </w:tcBorders>
             <w:shd w:val="clear" w:color="000000" w:fill="{{GFILL}}"/>
+            <w:noWrap/>
             <w:vAlign w:val="center"/>
             <w:hideMark/>
           </w:tcPr>
@@ -1909,26 +1886,23 @@
               <w:autoSpaceDE/>
               <w:autoSpaceDN/>
               <w:adjustRightInd/>
+              <w:spacing w:line="360" w:lineRule="auto"/>
               <w:jc w:val="center"/>
               <w:textAlignment w:val="auto"/>
               <w:rPr>
-                <w:rFonts w:ascii="Segoe UI" w:hAnsi="Segoe UI" w:cs="Segoe UI"/>
-                <w:b/>
-                <w:bCs/>
-                <w:color w:val="FFFFFF"/>
-                <w:sz w:val="16"/>
-                <w:szCs w:val="16"/>
+                <w:rFonts w:ascii="Arial" w:hAnsi="Arial" w:cs="Arial"/>
+                <w:b/>
+                <w:bCs/>
+                <w:color w:val="006100"/>
                 <w:lang w:val="es-PE" w:eastAsia="es-PE"/>
               </w:rPr>
             </w:pPr>
             <w:r>
               <w:rPr>
-                <w:rFonts w:ascii="Segoe UI" w:hAnsi="Segoe UI" w:cs="Segoe UI"/>
-                <w:b/>
-                <w:bCs/>
-                <w:color w:val="FFFFFF"/>
-                <w:sz w:val="16"/>
-                <w:szCs w:val="16"/>
+                <w:rFonts w:ascii="Arial" w:hAnsi="Arial" w:cs="Arial"/>
+                <w:b/>
+                <w:bCs/>
+                <w:color w:val="006100"/>
                 <w:lang w:val="es-PE" w:eastAsia="es-PE"/>
               </w:rPr>
               <w:t xml:space="preserve">{{GV}}</w:t>
@@ -1937,14 +1911,15 @@
         </w:tc>
         <w:tc>
           <w:tcPr>
-            <w:tcW w:w="1200" w:type="dxa"/>
+            <w:tcW w:w="1134" w:type="dxa"/>
             <w:tcBorders>
               <w:top w:val="nil"/>
-              <w:left w:val="nil"/>
+              <w:left w:val="single" w:sz="4" w:space="0" w:color="auto"/>
               <w:bottom w:val="single" w:sz="4" w:space="0" w:color="auto"/>
               <w:right w:val="single" w:sz="4" w:space="0" w:color="auto"/>
             </w:tcBorders>
-            <w:shd w:val="clear" w:color="000000" w:fill="C9C9C9"/>
+            <w:shd w:val="clear" w:color="000000" w:fill="D9D9D9"/>
+            <w:noWrap/>
             <w:vAlign w:val="center"/>
             <w:hideMark/>
           </w:tcPr>
@@ -1954,26 +1929,23 @@
               <w:autoSpaceDE/>
               <w:autoSpaceDN/>
               <w:adjustRightInd/>
+              <w:spacing w:line="360" w:lineRule="auto"/>
               <w:jc w:val="center"/>
               <w:textAlignment w:val="auto"/>
               <w:rPr>
-                <w:rFonts w:ascii="Segoe UI" w:hAnsi="Segoe UI" w:cs="Segoe UI"/>
-                <w:b/>
-                <w:bCs/>
-                <w:color w:val="1A2340"/>
-                <w:sz w:val="16"/>
-                <w:szCs w:val="16"/>
+                <w:rFonts w:ascii="Arial" w:hAnsi="Arial" w:cs="Arial"/>
+                <w:b/>
+                <w:bCs/>
+                <w:color w:val="000000"/>
                 <w:lang w:val="es-PE" w:eastAsia="es-PE"/>
               </w:rPr>
             </w:pPr>
             <w:r>
               <w:rPr>
-                <w:rFonts w:ascii="Segoe UI" w:hAnsi="Segoe UI" w:cs="Segoe UI"/>
-                <w:b/>
-                <w:bCs/>
-                <w:color w:val="1A2340"/>
-                <w:sz w:val="16"/>
-                <w:szCs w:val="16"/>
+                <w:rFonts w:ascii="Arial" w:hAnsi="Arial" w:cs="Arial"/>
+                <w:b/>
+                <w:bCs/>
+                <w:color w:val="000000"/>
                 <w:lang w:val="es-PE" w:eastAsia="es-PE"/>
               </w:rPr>
               <w:t xml:space="preserve">0 - 69.9%</w:t>
@@ -1982,14 +1954,15 @@
         </w:tc>
         <w:tc>
           <w:tcPr>
-            <w:tcW w:w="1200" w:type="dxa"/>
+            <w:tcW w:w="1134" w:type="dxa"/>
             <w:tcBorders>
               <w:top w:val="nil"/>
               <w:left w:val="nil"/>
               <w:bottom w:val="single" w:sz="4" w:space="0" w:color="auto"/>
               <w:right w:val="single" w:sz="4" w:space="0" w:color="auto"/>
             </w:tcBorders>
-            <w:shd w:val="clear" w:color="000000" w:fill="C9C9C9"/>
+            <w:shd w:val="clear" w:color="000000" w:fill="D9D9D9"/>
+            <w:noWrap/>
             <w:vAlign w:val="center"/>
             <w:hideMark/>
           </w:tcPr>
@@ -1999,26 +1972,23 @@
               <w:autoSpaceDE/>
               <w:autoSpaceDN/>
               <w:adjustRightInd/>
+              <w:spacing w:line="360" w:lineRule="auto"/>
               <w:jc w:val="center"/>
               <w:textAlignment w:val="auto"/>
               <w:rPr>
-                <w:rFonts w:ascii="Segoe UI" w:hAnsi="Segoe UI" w:cs="Segoe UI"/>
-                <w:b/>
-                <w:bCs/>
-                <w:color w:val="1A2340"/>
-                <w:sz w:val="16"/>
-                <w:szCs w:val="16"/>
+                <w:rFonts w:ascii="Arial" w:hAnsi="Arial" w:cs="Arial"/>
+                <w:b/>
+                <w:bCs/>
+                <w:color w:val="000000"/>
                 <w:lang w:val="es-PE" w:eastAsia="es-PE"/>
               </w:rPr>
             </w:pPr>
             <w:r>
               <w:rPr>
-                <w:rFonts w:ascii="Segoe UI" w:hAnsi="Segoe UI" w:cs="Segoe UI"/>
-                <w:b/>
-                <w:bCs/>
-                <w:color w:val="1A2340"/>
-                <w:sz w:val="16"/>
-                <w:szCs w:val="16"/>
+                <w:rFonts w:ascii="Arial" w:hAnsi="Arial" w:cs="Arial"/>
+                <w:b/>
+                <w:bCs/>
+                <w:color w:val="000000"/>
                 <w:lang w:val="es-PE" w:eastAsia="es-PE"/>
               </w:rPr>
               <w:t xml:space="preserve">70 - 100%</w:t>
@@ -2027,14 +1997,15 @@
         </w:tc>
         <w:tc>
           <w:tcPr>
-            <w:tcW w:w="1200" w:type="dxa"/>
+            <w:tcW w:w="1134" w:type="dxa"/>
             <w:tcBorders>
               <w:top w:val="nil"/>
               <w:left w:val="nil"/>
               <w:bottom w:val="single" w:sz="4" w:space="0" w:color="auto"/>
               <w:right w:val="single" w:sz="4" w:space="0" w:color="auto"/>
             </w:tcBorders>
-            <w:shd w:val="clear" w:color="000000" w:fill="C9C9C9"/>
+            <w:shd w:val="clear" w:color="000000" w:fill="D9D9D9"/>
+            <w:noWrap/>
             <w:vAlign w:val="center"/>
             <w:hideMark/>
           </w:tcPr>
@@ -2044,26 +2015,23 @@
               <w:autoSpaceDE/>
               <w:autoSpaceDN/>
               <w:adjustRightInd/>
+              <w:spacing w:line="360" w:lineRule="auto"/>
               <w:jc w:val="center"/>
               <w:textAlignment w:val="auto"/>
               <w:rPr>
-                <w:rFonts w:ascii="Segoe UI" w:hAnsi="Segoe UI" w:cs="Segoe UI"/>
-                <w:b/>
-                <w:bCs/>
-                <w:color w:val="1A2340"/>
-                <w:sz w:val="16"/>
-                <w:szCs w:val="16"/>
+                <w:rFonts w:ascii="Arial" w:hAnsi="Arial" w:cs="Arial"/>
+                <w:b/>
+                <w:bCs/>
+                <w:color w:val="000000"/>
                 <w:lang w:val="es-PE" w:eastAsia="es-PE"/>
               </w:rPr>
             </w:pPr>
             <w:r>
               <w:rPr>
-                <w:rFonts w:ascii="Segoe UI" w:hAnsi="Segoe UI" w:cs="Segoe UI"/>
-                <w:b/>
-                <w:bCs/>
-                <w:color w:val="1A2340"/>
-                <w:sz w:val="16"/>
-                <w:szCs w:val="16"/>
+                <w:rFonts w:ascii="Arial" w:hAnsi="Arial" w:cs="Arial"/>
+                <w:b/>
+                <w:bCs/>
+                <w:color w:val="000000"/>
                 <w:lang w:val="es-PE" w:eastAsia="es-PE"/>
               </w:rPr>
               <w:t xml:space="preserve">100%</w:t>
@@ -2074,157 +2042,60 @@
     </w:tbl>
     <w:p>
       <w:pPr>
+        <w:spacing w:line="360" w:lineRule="auto"/>
         <w:ind w:right="-518"/>
         <w:jc w:val="both"/>
         <w:rPr>
           <w:rFonts w:ascii="Arial" w:hAnsi="Arial" w:cs="Arial"/>
+        </w:rPr>
+      </w:pPr>
+    </w:p>
+    <w:p>
+      <w:pPr>
+        <w:spacing w:line="360" w:lineRule="auto"/>
+        <w:ind w:left="708"/>
+        <w:rPr>
+          <w:rFonts w:ascii="Arial" w:hAnsi="Arial" w:cs="Arial"/>
+        </w:rPr>
+      </w:pPr>
+    </w:p>
+    <w:p>
+      <w:pPr>
+        <w:spacing w:line="360" w:lineRule="auto"/>
+        <w:rPr>
+          <w:rFonts w:ascii="Arial" w:hAnsi="Arial" w:cs="Arial"/>
           <w:b/>
           <w:bCs/>
-          <w:u w:val="single"/>
-        </w:rPr>
-      </w:pPr>
-    </w:p>
-    <w:p>
-      <w:pPr>
-        <w:ind w:right="-518"/>
-        <w:jc w:val="both"/>
-        <w:rPr>
-          <w:rFonts w:ascii="Arial" w:hAnsi="Arial" w:cs="Arial"/>
-        </w:rPr>
-      </w:pPr>
-    </w:p>
-    <w:p>
-      <w:pPr>
-        <w:ind w:left="708"/>
-        <w:rPr>
-          <w:rFonts w:ascii="Arial" w:hAnsi="Arial" w:cs="Arial"/>
-        </w:rPr>
-      </w:pPr>
-    </w:p>
-    <w:p>
-      <w:pPr>
-        <w:ind w:left="708"/>
-        <w:rPr>
-          <w:rFonts w:ascii="Arial" w:hAnsi="Arial" w:cs="Arial"/>
-        </w:rPr>
-      </w:pPr>
-    </w:p>
-    <w:p>
-      <w:pPr>
-        <w:tabs>
-          <w:tab w:val="left" w:pos="2643"/>
-        </w:tabs>
-        <w:ind w:left="708"/>
-        <w:rPr>
-          <w:rFonts w:ascii="Arial" w:hAnsi="Arial" w:cs="Arial"/>
-        </w:rPr>
-      </w:pPr>
-      <w:r>
-        <w:rPr>
-          <w:rFonts w:ascii="Arial" w:hAnsi="Arial" w:cs="Arial"/>
-        </w:rPr>
-        <w:tab/>
-      </w:r>
-    </w:p>
-    <w:p>
-      <w:pPr>
-        <w:ind w:left="708"/>
-        <w:rPr>
-          <w:rFonts w:ascii="Arial" w:hAnsi="Arial" w:cs="Arial"/>
-        </w:rPr>
-      </w:pPr>
-    </w:p>
-    <w:p>
-      <w:pPr>
-        <w:ind w:left="708"/>
-        <w:rPr>
-          <w:rFonts w:ascii="Arial" w:hAnsi="Arial" w:cs="Arial"/>
-        </w:rPr>
-      </w:pPr>
-    </w:p>
-    <w:p>
-      <w:pPr>
-        <w:ind w:left="708"/>
-        <w:rPr>
-          <w:rFonts w:ascii="Arial" w:hAnsi="Arial" w:cs="Arial"/>
-        </w:rPr>
-      </w:pPr>
-    </w:p>
-    <w:p>
-      <w:pPr>
-        <w:ind w:left="708"/>
-        <w:rPr>
-          <w:rFonts w:ascii="Arial" w:hAnsi="Arial" w:cs="Arial"/>
-        </w:rPr>
-      </w:pPr>
-    </w:p>
-    <w:p>
-      <w:pPr>
-        <w:ind w:left="708"/>
-        <w:rPr>
-          <w:rFonts w:ascii="Arial" w:hAnsi="Arial" w:cs="Arial"/>
-        </w:rPr>
-      </w:pPr>
-    </w:p>
-    <w:p>
-      <w:pPr>
-        <w:ind w:left="708"/>
-        <w:rPr>
-          <w:rFonts w:ascii="Arial" w:hAnsi="Arial" w:cs="Arial"/>
-        </w:rPr>
-      </w:pPr>
-    </w:p>
-    <w:p>
-      <w:pPr>
-        <w:ind w:left="708"/>
-        <w:rPr>
-          <w:rFonts w:ascii="Arial" w:hAnsi="Arial" w:cs="Arial"/>
-        </w:rPr>
-      </w:pPr>
-    </w:p>
-    <w:p>
-      <w:pPr>
-        <w:ind w:left="708"/>
-        <w:rPr>
-          <w:rFonts w:ascii="Arial" w:hAnsi="Arial" w:cs="Arial"/>
-        </w:rPr>
-      </w:pPr>
-    </w:p>
-    <w:p>
-      <w:pPr>
-        <w:ind w:left="708"/>
-        <w:rPr>
-          <w:rFonts w:ascii="Arial" w:hAnsi="Arial" w:cs="Arial"/>
-        </w:rPr>
-      </w:pPr>
-    </w:p>
-    <w:p>
-      <w:pPr>
+        </w:rPr>
+      </w:pPr>
+      <w:r>
         <w:rPr>
           <w:rFonts w:ascii="Arial" w:hAnsi="Arial" w:cs="Arial"/>
           <w:b/>
           <w:bCs/>
         </w:rPr>
-      </w:pPr>
+        <w:t>IV. EVIDENCIA</w:t>
+      </w:r>
       <w:r>
         <w:rPr>
           <w:rFonts w:ascii="Arial" w:hAnsi="Arial" w:cs="Arial"/>
           <w:b/>
           <w:bCs/>
         </w:rPr>
-        <w:lastRenderedPageBreak/>
-        <w:t>IV. EVIDENCIA:</w:t>
-      </w:r>
-      <w:r>
-        <w:rPr>
-          <w:noProof/>
-          <w14:ligatures w14:val="standardContextual"/>
-        </w:rPr>
-        <w:t xml:space="preserve"> </w:t>
-      </w:r>
-    </w:p>
-    <w:p>
-      <w:pPr>
+        <w:t xml:space="preserve"> FOTOGRÁFICA</w:t>
+      </w:r>
+      <w:r>
+        <w:rPr>
+          <w:rFonts w:ascii="Arial" w:hAnsi="Arial" w:cs="Arial"/>
+          <w:b/>
+          <w:bCs/>
+        </w:rPr>
+        <w:t>:</w:t>
+      </w:r>
+    </w:p>
+    <w:p>
+      <w:pPr>
+        <w:spacing w:line="360" w:lineRule="auto"/>
         <w:rPr>
           <w:rFonts w:ascii="Arial" w:hAnsi="Arial" w:cs="Arial"/>
         </w:rPr>
@@ -2239,24 +2110,24 @@
     <w:tbl>
       <w:tblPr>
         <w:tblStyle w:val="Tablaconcuadrcula"/>
-        <w:tblW w:w="9640" w:type="dxa"/>
-        <w:tblInd w:w="-714" w:type="dxa"/>
+        <w:tblW w:w="0" w:type="auto"/>
         <w:tblLook w:val="04A0" w:firstRow="1" w:lastRow="0" w:firstColumn="1" w:lastColumn="0" w:noHBand="0" w:noVBand="1"/>
       </w:tblPr>
       <w:tblGrid>
-        <w:gridCol w:w="5065"/>
-        <w:gridCol w:w="4575"/>
+        <w:gridCol w:w="4247"/>
+        <w:gridCol w:w="4247"/>
       </w:tblGrid>
       <w:tr>
         <w:trPr>
-          <w:trHeight w:val="3923"/>
+          <w:trHeight w:val="4880"/>
         </w:trPr>
         <w:tc>
           <w:tcPr>
-            <w:tcW w:w="5065" w:type="dxa"/>
+            <w:tcW w:w="4531" w:type="dxa"/>
           </w:tcPr>
           <w:p>
             <w:pPr>
+              <w:spacing w:line="360" w:lineRule="auto"/>
               <w:rPr>
                 <w:rFonts w:ascii="Arial" w:hAnsi="Arial" w:cs="Arial"/>
                 <w:b/>
@@ -2266,48 +2137,20 @@
             <w:r>
               <w:rPr>
                 <w:rFonts w:ascii="Arial" w:hAnsi="Arial" w:cs="Arial"/>
-                <w:color w:val="808080"/>
-                <w:sz w:val="18"/>
-              </w:rPr>
-              <w:t xml:space="preserve">[ Inserte aquí la foto ]</w:t>
+                <w:b/>
+                <w:bCs/>
+              </w:rPr>
+              <w:t>Foto 1</w:t>
             </w:r>
-          </w:p>
-          <w:p>
-            <w:pPr>
-              <w:rPr>
-                <w:rFonts w:ascii="Arial" w:hAnsi="Arial" w:cs="Arial"/>
-                <w:b/>
-                <w:bCs/>
-                <w:lang w:val="es-PE"/>
-              </w:rPr>
-            </w:pPr>
-          </w:p>
-          <w:p>
-            <w:pPr>
-              <w:rPr>
-                <w:rFonts w:ascii="Arial" w:hAnsi="Arial" w:cs="Arial"/>
-                <w:b/>
-                <w:bCs/>
-                <w:lang w:val="es-PE"/>
-              </w:rPr>
-            </w:pPr>
-          </w:p>
-          <w:p>
-            <w:pPr>
-              <w:rPr>
-                <w:rFonts w:ascii="Arial" w:hAnsi="Arial" w:cs="Arial"/>
-                <w:b/>
-                <w:bCs/>
-              </w:rPr>
-            </w:pPr>
           </w:p>
         </w:tc>
         <w:tc>
           <w:tcPr>
-            <w:tcW w:w="4575" w:type="dxa"/>
+            <w:tcW w:w="4531" w:type="dxa"/>
           </w:tcPr>
           <w:p>
             <w:pPr>
+              <w:spacing w:line="360" w:lineRule="auto"/>
               <w:rPr>
                 <w:rFonts w:ascii="Arial" w:hAnsi="Arial" w:cs="Arial"/>
                 <w:b/>
@@ -2317,529 +2160,127 @@
             <w:r>
               <w:rPr>
                 <w:rFonts w:ascii="Arial" w:hAnsi="Arial" w:cs="Arial"/>
-                <w:color w:val="808080"/>
-                <w:sz w:val="18"/>
-              </w:rPr>
-              <w:t xml:space="preserve">[ Inserte aquí la foto ]</w:t>
+                <w:b/>
+                <w:bCs/>
+              </w:rPr>
+              <w:t>Foto 2</w:t>
             </w:r>
-          </w:p>
-          <w:p>
-            <w:pPr>
-              <w:rPr>
-                <w:rFonts w:ascii="Arial" w:hAnsi="Arial" w:cs="Arial"/>
-                <w:b/>
-                <w:bCs/>
-                <w:lang w:val="es-PE"/>
-              </w:rPr>
-            </w:pPr>
-          </w:p>
-          <w:p>
-            <w:pPr>
-              <w:rPr>
-                <w:rFonts w:ascii="Arial" w:hAnsi="Arial" w:cs="Arial"/>
-                <w:b/>
-                <w:bCs/>
-                <w:lang w:val="es-PE"/>
-              </w:rPr>
-            </w:pPr>
-          </w:p>
-          <w:p>
-            <w:pPr>
-              <w:rPr>
-                <w:rFonts w:ascii="Arial" w:hAnsi="Arial" w:cs="Arial"/>
-                <w:b/>
-                <w:bCs/>
-                <w:lang w:val="es-PE"/>
-              </w:rPr>
-            </w:pPr>
-          </w:p>
-          <w:p>
-            <w:pPr>
-              <w:rPr>
-                <w:rFonts w:ascii="Arial" w:hAnsi="Arial" w:cs="Arial"/>
-                <w:b/>
-                <w:bCs/>
-              </w:rPr>
-            </w:pPr>
           </w:p>
         </w:tc>
       </w:tr>
       <w:tr>
         <w:trPr>
-          <w:trHeight w:val="3886"/>
+          <w:trHeight w:val="4880"/>
         </w:trPr>
         <w:tc>
           <w:tcPr>
-            <w:tcW w:w="5065" w:type="dxa"/>
+            <w:tcW w:w="4531" w:type="dxa"/>
           </w:tcPr>
           <w:p>
             <w:pPr>
-              <w:rPr>
-                <w:rFonts w:ascii="Arial" w:hAnsi="Arial" w:cs="Arial"/>
-                <w:b/>
-                <w:bCs/>
-                <w:lang w:val="es-PE"/>
+              <w:spacing w:line="360" w:lineRule="auto"/>
+              <w:rPr>
+                <w:rFonts w:ascii="Arial" w:hAnsi="Arial" w:cs="Arial"/>
+                <w:b/>
+                <w:bCs/>
               </w:rPr>
             </w:pPr>
             <w:r>
               <w:rPr>
                 <w:rFonts w:ascii="Arial" w:hAnsi="Arial" w:cs="Arial"/>
-                <w:color w:val="808080"/>
-                <w:sz w:val="18"/>
-              </w:rPr>
-              <w:t xml:space="preserve">[ Inserte aquí la foto ]</w:t>
+                <w:b/>
+                <w:bCs/>
+              </w:rPr>
+              <w:t>Foto 3</w:t>
             </w:r>
-          </w:p>
-          <w:p>
-            <w:pPr>
-              <w:rPr>
-                <w:rFonts w:ascii="Arial" w:hAnsi="Arial" w:cs="Arial"/>
-                <w:b/>
-                <w:bCs/>
-                <w:lang w:val="es-PE"/>
-              </w:rPr>
-            </w:pPr>
-          </w:p>
-          <w:p>
-            <w:pPr>
-              <w:rPr>
-                <w:rFonts w:ascii="Arial" w:hAnsi="Arial" w:cs="Arial"/>
-                <w:b/>
-                <w:bCs/>
-                <w:lang w:val="es-PE"/>
-              </w:rPr>
-            </w:pPr>
-          </w:p>
-          <w:p>
-            <w:pPr>
-              <w:rPr>
-                <w:rFonts w:ascii="Arial" w:hAnsi="Arial" w:cs="Arial"/>
-                <w:b/>
-                <w:bCs/>
-                <w:lang w:val="es-PE"/>
-              </w:rPr>
-            </w:pPr>
-          </w:p>
-          <w:p>
-            <w:pPr>
-              <w:rPr>
-                <w:rFonts w:ascii="Arial" w:hAnsi="Arial" w:cs="Arial"/>
-                <w:b/>
-                <w:bCs/>
-              </w:rPr>
-            </w:pPr>
           </w:p>
         </w:tc>
         <w:tc>
           <w:tcPr>
-            <w:tcW w:w="4575" w:type="dxa"/>
+            <w:tcW w:w="4531" w:type="dxa"/>
           </w:tcPr>
           <w:p>
             <w:pPr>
-              <w:rPr>
-                <w:rFonts w:ascii="Arial" w:hAnsi="Arial" w:cs="Arial"/>
-                <w:b/>
-                <w:bCs/>
-                <w:lang w:val="es-PE"/>
+              <w:spacing w:line="360" w:lineRule="auto"/>
+              <w:rPr>
+                <w:rFonts w:ascii="Arial" w:hAnsi="Arial" w:cs="Arial"/>
+                <w:b/>
+                <w:bCs/>
               </w:rPr>
             </w:pPr>
             <w:r>
               <w:rPr>
                 <w:rFonts w:ascii="Arial" w:hAnsi="Arial" w:cs="Arial"/>
-                <w:color w:val="808080"/>
-                <w:sz w:val="18"/>
-              </w:rPr>
-              <w:t xml:space="preserve">[ Inserte aquí la foto ]</w:t>
+                <w:b/>
+                <w:bCs/>
+              </w:rPr>
+              <w:t>Foto 4</w:t>
             </w:r>
-          </w:p>
-          <w:p>
-            <w:pPr>
-              <w:rPr>
-                <w:rFonts w:ascii="Arial" w:hAnsi="Arial" w:cs="Arial"/>
-                <w:b/>
-                <w:bCs/>
-                <w:lang w:val="es-PE"/>
-              </w:rPr>
-            </w:pPr>
-          </w:p>
-          <w:p>
-            <w:pPr>
-              <w:rPr>
-                <w:rFonts w:ascii="Arial" w:hAnsi="Arial" w:cs="Arial"/>
-                <w:b/>
-                <w:bCs/>
-              </w:rPr>
-            </w:pPr>
           </w:p>
         </w:tc>
       </w:tr>
     </w:tbl>
     <w:p>
       <w:pPr>
-        <w:rPr>
-          <w:rFonts w:ascii="Arial" w:hAnsi="Arial" w:cs="Arial"/>
-        </w:rPr>
-      </w:pPr>
-    </w:p>
-    <w:p>
-      <w:pPr>
+        <w:spacing w:line="360" w:lineRule="auto"/>
+        <w:rPr>
+          <w:rFonts w:ascii="Arial" w:hAnsi="Arial" w:cs="Arial"/>
+        </w:rPr>
+      </w:pPr>
+    </w:p>
+    <w:p>
+      <w:pPr>
+        <w:spacing w:line="360" w:lineRule="auto"/>
         <w:rPr>
           <w:rFonts w:ascii="Arial" w:hAnsi="Arial" w:cs="Arial"/>
           <w:b/>
           <w:bCs/>
         </w:rPr>
       </w:pPr>
-    </w:p>
-    <w:p>
-      <w:pPr>
+      <w:r>
         <w:rPr>
           <w:rFonts w:ascii="Arial" w:hAnsi="Arial" w:cs="Arial"/>
           <w:b/>
           <w:bCs/>
         </w:rPr>
-      </w:pPr>
-    </w:p>
-    <w:p>
-      <w:pPr>
-        <w:rPr>
-          <w:rFonts w:ascii="Arial" w:hAnsi="Arial" w:cs="Arial"/>
-          <w:b/>
-          <w:bCs/>
-        </w:rPr>
-      </w:pPr>
-    </w:p>
-    <w:p>
-      <w:pPr>
-        <w:rPr>
-          <w:rFonts w:ascii="Arial" w:hAnsi="Arial" w:cs="Arial"/>
-          <w:b/>
-          <w:bCs/>
-        </w:rPr>
-      </w:pPr>
-    </w:p>
-    <w:p>
-      <w:pPr>
-        <w:rPr>
-          <w:rFonts w:ascii="Arial" w:hAnsi="Arial" w:cs="Arial"/>
-          <w:b/>
-          <w:bCs/>
-        </w:rPr>
-      </w:pPr>
-    </w:p>
-    <w:p>
-      <w:pPr>
-        <w:rPr>
-          <w:rFonts w:ascii="Arial" w:hAnsi="Arial" w:cs="Arial"/>
-          <w:b/>
-          <w:bCs/>
-        </w:rPr>
-      </w:pPr>
-    </w:p>
-    <w:p>
-      <w:pPr>
-        <w:rPr>
-          <w:rFonts w:ascii="Arial" w:hAnsi="Arial" w:cs="Arial"/>
-          <w:b/>
-          <w:bCs/>
-        </w:rPr>
-      </w:pPr>
-    </w:p>
-    <w:p>
-      <w:pPr>
-        <w:rPr>
-          <w:rFonts w:ascii="Arial" w:hAnsi="Arial" w:cs="Arial"/>
-          <w:b/>
-          <w:bCs/>
-        </w:rPr>
-      </w:pPr>
-    </w:p>
-    <w:p>
-      <w:pPr>
-        <w:rPr>
-          <w:rFonts w:ascii="Arial" w:hAnsi="Arial" w:cs="Arial"/>
-          <w:b/>
-          <w:bCs/>
-        </w:rPr>
-      </w:pPr>
-    </w:p>
-    <w:p>
-      <w:pPr>
-        <w:rPr>
-          <w:rFonts w:ascii="Arial" w:hAnsi="Arial" w:cs="Arial"/>
-          <w:b/>
-          <w:bCs/>
-        </w:rPr>
-      </w:pPr>
-    </w:p>
-    <w:p>
-      <w:pPr>
-        <w:rPr>
-          <w:rFonts w:ascii="Arial" w:hAnsi="Arial" w:cs="Arial"/>
-          <w:b/>
-          <w:bCs/>
-        </w:rPr>
-      </w:pPr>
-    </w:p>
-    <w:p>
-      <w:pPr>
-        <w:rPr>
-          <w:rFonts w:ascii="Arial" w:hAnsi="Arial" w:cs="Arial"/>
-          <w:b/>
-          <w:bCs/>
-        </w:rPr>
-      </w:pPr>
-    </w:p>
-    <w:p>
-      <w:pPr>
-        <w:rPr>
-          <w:rFonts w:ascii="Arial" w:hAnsi="Arial" w:cs="Arial"/>
-          <w:b/>
-          <w:bCs/>
-        </w:rPr>
-      </w:pPr>
-    </w:p>
-    <w:p>
-      <w:pPr>
-        <w:rPr>
-          <w:rFonts w:ascii="Arial" w:hAnsi="Arial" w:cs="Arial"/>
-          <w:b/>
-          <w:bCs/>
-        </w:rPr>
-      </w:pPr>
-    </w:p>
-    <w:p>
-      <w:pPr>
-        <w:rPr>
-          <w:rFonts w:ascii="Arial" w:hAnsi="Arial" w:cs="Arial"/>
-          <w:b/>
-          <w:bCs/>
-        </w:rPr>
-      </w:pPr>
-    </w:p>
-    <w:p>
-      <w:pPr>
-        <w:rPr>
-          <w:rFonts w:ascii="Arial" w:hAnsi="Arial" w:cs="Arial"/>
-          <w:b/>
-          <w:bCs/>
-        </w:rPr>
-      </w:pPr>
-    </w:p>
-    <w:p>
-      <w:pPr>
-        <w:rPr>
-          <w:rFonts w:ascii="Arial" w:hAnsi="Arial" w:cs="Arial"/>
-          <w:b/>
-          <w:bCs/>
-        </w:rPr>
-      </w:pPr>
-    </w:p>
-    <w:p>
-      <w:pPr>
-        <w:rPr>
-          <w:rFonts w:ascii="Arial" w:hAnsi="Arial" w:cs="Arial"/>
-          <w:b/>
-          <w:bCs/>
-        </w:rPr>
-      </w:pPr>
-    </w:p>
-    <w:p>
-      <w:pPr>
-        <w:rPr>
-          <w:rFonts w:ascii="Arial" w:hAnsi="Arial" w:cs="Arial"/>
-          <w:b/>
-          <w:bCs/>
-        </w:rPr>
-      </w:pPr>
-    </w:p>
-    <w:p>
-      <w:pPr>
-        <w:rPr>
-          <w:rFonts w:ascii="Arial" w:hAnsi="Arial" w:cs="Arial"/>
-          <w:b/>
-          <w:bCs/>
-        </w:rPr>
-      </w:pPr>
-    </w:p>
-    <w:p>
-      <w:pPr>
-        <w:rPr>
-          <w:rFonts w:ascii="Arial" w:hAnsi="Arial" w:cs="Arial"/>
-          <w:b/>
-          <w:bCs/>
-        </w:rPr>
-      </w:pPr>
-    </w:p>
-    <w:p>
-      <w:pPr>
-        <w:pStyle w:val="Prrafodelista"/>
-        <w:numPr>
-          <w:ilvl w:val="0"/>
-          <w:numId w:val="7"/>
-        </w:numPr>
-        <w:jc w:val="both"/>
-        <w:rPr>
-          <w:rFonts w:ascii="Arial" w:hAnsi="Arial" w:cs="Arial"/>
-          <w:b/>
-          <w:bCs/>
-        </w:rPr>
-      </w:pPr>
-      <w:r>
-        <w:rPr>
-          <w:rFonts w:ascii="Arial" w:hAnsi="Arial" w:cs="Arial"/>
-          <w:b/>
-          <w:bCs/>
-        </w:rPr>
-        <w:t>CONCLUSIONES:</w:t>
-      </w:r>
-    </w:p>
-    <w:p>
-      <w:pPr>
-        <w:spacing w:line="276" w:lineRule="auto"/>
-        <w:jc w:val="both"/>
-        <w:rPr>
-          <w:rFonts w:ascii="Arial" w:hAnsi="Arial" w:cs="Arial"/>
-        </w:rPr>
-      </w:pPr>
-      <w:r>
-        <w:rPr>
-          <w:rFonts w:ascii="Arial" w:hAnsi="Arial" w:cs="Arial"/>
-        </w:rPr>
-        <w:t xml:space="preserve">Como resultado de la evaluación, el grupo obtuvo un </w:t>
-      </w:r>
-      <w:r>
-        <w:rPr>
-          <w:rFonts w:ascii="Arial" w:hAnsi="Arial" w:cs="Arial"/>
-          <w:b/>
-          <w:bCs/>
-        </w:rPr>
-        <w:t xml:space="preserve">promedio general de {{PROM}} %,</w:t>
-      </w:r>
-      <w:r>
-        <w:rPr>
-          <w:rFonts w:ascii="Arial" w:hAnsi="Arial" w:cs="Arial"/>
-          <w:b/>
-          <w:bCs/>
-        </w:rPr>
-        <w:t xml:space="preserve"/>
-      </w:r>
-      <w:r>
-        <w:rPr>
-          <w:rFonts w:ascii="Arial" w:hAnsi="Arial" w:cs="Arial"/>
-          <w:b/>
-          <w:bCs/>
-        </w:rPr>
-        <w:t xml:space="preserve"/>
-      </w:r>
-      <w:r>
-        <w:rPr>
-          <w:rFonts w:ascii="Arial" w:hAnsi="Arial" w:cs="Arial"/>
-        </w:rPr>
-        <w:t xml:space="preserve">{{CONC1}}</w:t>
-      </w:r>
-    </w:p>
-    <w:p>
-      <w:pPr>
-        <w:spacing w:line="276" w:lineRule="auto"/>
-        <w:jc w:val="both"/>
-        <w:rPr>
-          <w:rFonts w:ascii="Arial" w:hAnsi="Arial" w:cs="Arial"/>
-          <w:lang w:val="es-PE"/>
-        </w:rPr>
-      </w:pPr>
-    </w:p>
-    <w:p>
-      <w:pPr>
-        <w:spacing w:line="276" w:lineRule="auto"/>
-        <w:jc w:val="both"/>
-        <w:rPr>
-          <w:rFonts w:ascii="Arial" w:hAnsi="Arial" w:cs="Arial"/>
-          <w:lang w:val="es-PE"/>
-        </w:rPr>
-      </w:pPr>
-      <w:r>
-        <w:rPr>
-          <w:rFonts w:ascii="Arial" w:hAnsi="Arial" w:cs="Arial"/>
-          <w:lang w:val="es-PE"/>
-        </w:rPr>
-        <w:t>Los resultados obtenidos por sección fueron los siguientes:</w:t>
-      </w:r>
-    </w:p>
-    <w:p>
-      <w:pPr>
-        <w:spacing w:line="276" w:lineRule="auto"/>
-        <w:jc w:val="both"/>
-        <w:rPr>
-          <w:rFonts w:ascii="Arial" w:hAnsi="Arial" w:cs="Arial"/>
-          <w:lang w:val="es-PE"/>
-        </w:rPr>
-      </w:pPr>
-    </w:p>
-    <w:p>
-      <w:pPr>
-        <w:numPr>
-          <w:ilvl w:val="0"/>
-          <w:numId w:val="12"/>
-        </w:numPr>
-        <w:spacing w:line="276" w:lineRule="auto"/>
-        <w:jc w:val="both"/>
-        <w:rPr>
-          <w:rFonts w:ascii="Arial" w:hAnsi="Arial" w:cs="Arial"/>
-          <w:lang w:val="es-PE"/>
-        </w:rPr>
-      </w:pPr>
-      <w:r>
-        <w:rPr>
-          <w:rFonts w:ascii="Arial" w:hAnsi="Arial" w:cs="Arial"/>
-          <w:lang w:val="es-PE"/>
-        </w:rPr>
-        <w:t xml:space="preserve">{{BN}}: {{BV}}</w:t>
-      </w:r>
-      <w:r>
-        <w:rPr>
-          <w:rFonts w:ascii="Arial" w:hAnsi="Arial" w:cs="Arial"/>
-          <w:lang w:val="es-PE"/>
-        </w:rPr>
-        <w:t xml:space="preserve"/>
-      </w:r>
-      <w:r>
-        <w:rPr>
-          <w:rFonts w:ascii="Arial" w:hAnsi="Arial" w:cs="Arial"/>
-          <w:lang w:val="es-PE"/>
-        </w:rPr>
-        <w:t xml:space="preserve"> %.</w:t>
-      </w:r>
-    </w:p>
-    <w:p>
-      <w:pPr>
-        <w:spacing w:line="276" w:lineRule="auto"/>
-        <w:ind w:left="720"/>
-        <w:jc w:val="both"/>
-        <w:rPr>
-          <w:rFonts w:ascii="Arial" w:hAnsi="Arial" w:cs="Arial"/>
-          <w:lang w:val="es-PE"/>
-        </w:rPr>
-      </w:pPr>
-    </w:p>
-    <w:p>
-      <w:pPr>
-        <w:spacing w:line="276" w:lineRule="auto"/>
-        <w:jc w:val="both"/>
-        <w:rPr>
-          <w:rFonts w:ascii="Arial" w:hAnsi="Arial" w:cs="Arial"/>
-          <w:lang w:val="es-PE"/>
-        </w:rPr>
-      </w:pPr>
-      <w:r>
-        <w:rPr>
-          <w:rFonts w:ascii="Arial" w:hAnsi="Arial" w:cs="Arial"/>
-        </w:rPr>
-        <w:t xml:space="preserve">{{CONC2}}</w:t>
-      </w:r>
-    </w:p>
-    <w:p>
-      <w:pPr>
-        <w:spacing w:line="276" w:lineRule="auto"/>
+        <w:lastRenderedPageBreak/>
+        <w:t>V. CONCLUSIONES:</w:t>
+      </w:r>
+    </w:p>
+    <w:p>
+      <w:pPr>
+        <w:spacing w:line="360" w:lineRule="auto"/>
+        <w:rPr>
+          <w:rFonts w:ascii="Arial" w:hAnsi="Arial" w:cs="Arial"/>
+        </w:rPr>
+      </w:pPr>
+      <w:r>
+        <w:rPr>
+          <w:rFonts w:ascii="Arial" w:hAnsi="Arial" w:cs="Arial"/>
+        </w:rPr>
+        <w:tab/>
+      </w:r>
+    </w:p>
+    <w:p>
+      <w:pPr>
+        <w:spacing w:line="360" w:lineRule="auto"/>
+        <w:ind w:firstLine="708"/>
+        <w:rPr>
+          <w:rFonts w:ascii="Arial" w:hAnsi="Arial" w:cs="Arial"/>
+          <w:color w:val="EE0000"/>
+        </w:rPr>
+      </w:pPr>
+      <w:r>
+        <w:rPr>
+          <w:rFonts w:ascii="Arial" w:hAnsi="Arial" w:cs="Arial"/>
+          <w:color w:val="EE0000"/>
+        </w:rPr>
+        <w:t xml:space="preserve">{{CONC}}</w:t>
+      </w:r>
+    </w:p>
+    <w:p>
+      <w:pPr>
+        <w:spacing w:line="360" w:lineRule="auto"/>
         <w:jc w:val="both"/>
         <w:rPr>
           <w:rFonts w:ascii="Arial" w:eastAsiaTheme="minorEastAsia" w:hAnsi="Arial" w:cs="Arial"/>
@@ -2851,7 +2292,7 @@
     </w:p>
     <w:p>
       <w:pPr>
-        <w:spacing w:line="276" w:lineRule="auto"/>
+        <w:spacing w:line="360" w:lineRule="auto"/>
         <w:jc w:val="both"/>
         <w:rPr>
           <w:rFonts w:ascii="Arial" w:eastAsiaTheme="minorEastAsia" w:hAnsi="Arial" w:cs="Arial"/>
@@ -2863,7 +2304,7 @@
     </w:p>
     <w:p>
       <w:pPr>
-        <w:spacing w:line="276" w:lineRule="auto"/>
+        <w:spacing w:line="360" w:lineRule="auto"/>
         <w:jc w:val="both"/>
         <w:rPr>
           <w:rFonts w:ascii="Arial" w:eastAsiaTheme="minorEastAsia" w:hAnsi="Arial" w:cs="Arial"/>
@@ -2889,7 +2330,7 @@
           <w:ilvl w:val="0"/>
           <w:numId w:val="10"/>
         </w:numPr>
-        <w:spacing w:after="0"/>
+        <w:spacing w:after="0" w:line="360" w:lineRule="auto"/>
         <w:jc w:val="both"/>
         <w:rPr>
           <w:rFonts w:ascii="Arial" w:hAnsi="Arial" w:cs="Arial"/>
@@ -2910,47 +2351,88 @@
     </w:p>
     <w:p>
       <w:pPr>
+        <w:pStyle w:val="Prrafodelista"/>
+        <w:numPr>
+          <w:ilvl w:val="0"/>
+          <w:numId w:val="10"/>
+        </w:numPr>
+        <w:spacing w:after="0" w:line="360" w:lineRule="auto"/>
         <w:jc w:val="both"/>
         <w:rPr>
           <w:rFonts w:ascii="Arial" w:hAnsi="Arial" w:cs="Arial"/>
-        </w:rPr>
-      </w:pPr>
-    </w:p>
-    <w:p>
-      <w:pPr>
+          <w:sz w:val="20"/>
+          <w:szCs w:val="20"/>
+          <w:lang w:val="es-ES"/>
+        </w:rPr>
+      </w:pPr>
+      <w:r>
+        <w:rPr>
+          <w:rFonts w:ascii="Arial" w:hAnsi="Arial" w:cs="Arial"/>
+          <w:sz w:val="20"/>
+          <w:szCs w:val="20"/>
+          <w:lang w:val="es-ES"/>
+        </w:rPr>
+        <w:t>CAP-SC-10. LEGISLACIÓN LABORAL, MECANISMO DE QUEJAS Y SUGERENCIAS, HOSTIGAMIENTO SEXUAL, CÓDIGO DE CONDUCTA, MEDIOAMBIENTE, ÉTICA EMPRESARIAL.</w:t>
+      </w:r>
+    </w:p>
+    <w:p>
+      <w:pPr>
+        <w:spacing w:line="360" w:lineRule="auto"/>
         <w:jc w:val="both"/>
         <w:rPr>
           <w:rFonts w:ascii="Arial" w:hAnsi="Arial" w:cs="Arial"/>
-          <w:color w:val="000000" w:themeColor="text1"/>
-        </w:rPr>
-      </w:pPr>
-    </w:p>
-    <w:p>
-      <w:pPr>
+        </w:rPr>
+      </w:pPr>
+    </w:p>
+    <w:p>
+      <w:pPr>
+        <w:spacing w:line="360" w:lineRule="auto"/>
         <w:ind w:left="-284" w:firstLine="284"/>
         <w:jc w:val="both"/>
         <w:rPr>
           <w:rFonts w:ascii="Arial" w:hAnsi="Arial" w:cs="Arial"/>
         </w:rPr>
       </w:pPr>
-      <w:r>
-        <w:rPr>
-          <w:rFonts w:ascii="Arial" w:hAnsi="Arial" w:cs="Arial"/>
-        </w:rPr>
-        <w:t>Es todo en cuanto tengo que informar.</w:t>
-      </w:r>
-    </w:p>
-    <w:p>
-      <w:pPr>
+    </w:p>
+    <w:p>
+      <w:pPr>
+        <w:spacing w:line="360" w:lineRule="auto"/>
         <w:ind w:left="-284" w:firstLine="284"/>
         <w:jc w:val="both"/>
         <w:rPr>
           <w:rFonts w:ascii="Arial" w:hAnsi="Arial" w:cs="Arial"/>
         </w:rPr>
       </w:pPr>
-    </w:p>
-    <w:p>
-      <w:pPr>
+      <w:r>
+        <w:rPr>
+          <w:rFonts w:ascii="Arial" w:hAnsi="Arial" w:cs="Arial"/>
+        </w:rPr>
+        <w:t>Es todo en cuanto tengo que informar.</w:t>
+      </w:r>
+    </w:p>
+    <w:p>
+      <w:pPr>
+        <w:spacing w:line="360" w:lineRule="auto"/>
+        <w:jc w:val="both"/>
+        <w:rPr>
+          <w:rFonts w:ascii="Arial" w:hAnsi="Arial" w:cs="Arial"/>
+          <w:color w:val="000000" w:themeColor="text1"/>
+        </w:rPr>
+      </w:pPr>
+    </w:p>
+    <w:p>
+      <w:pPr>
+        <w:spacing w:line="360" w:lineRule="auto"/>
+        <w:jc w:val="both"/>
+        <w:rPr>
+          <w:rFonts w:ascii="Arial" w:hAnsi="Arial" w:cs="Arial"/>
+          <w:color w:val="000000" w:themeColor="text1"/>
+        </w:rPr>
+      </w:pPr>
+    </w:p>
+    <w:p>
+      <w:pPr>
+        <w:spacing w:line="360" w:lineRule="auto"/>
         <w:ind w:left="-284" w:firstLine="284"/>
         <w:jc w:val="both"/>
         <w:rPr>
@@ -2960,63 +2442,53 @@
     </w:p>
     <w:p>
       <w:pPr>
+        <w:spacing w:line="360" w:lineRule="auto"/>
         <w:ind w:left="-284" w:firstLine="284"/>
         <w:jc w:val="both"/>
         <w:rPr>
           <w:rFonts w:ascii="Arial" w:hAnsi="Arial" w:cs="Arial"/>
         </w:rPr>
       </w:pPr>
-    </w:p>
-    <w:p>
-      <w:pPr>
-        <w:ind w:left="-284" w:firstLine="284"/>
+      <w:r>
+        <w:rPr>
+          <w:rFonts w:ascii="Arial" w:hAnsi="Arial" w:cs="Arial"/>
+        </w:rPr>
+        <w:t>FIRMA DIGITAL</w:t>
+      </w:r>
+    </w:p>
+    <w:p>
+      <w:pPr>
+        <w:spacing w:line="360" w:lineRule="auto"/>
         <w:jc w:val="both"/>
         <w:rPr>
           <w:rFonts w:ascii="Arial" w:hAnsi="Arial" w:cs="Arial"/>
-        </w:rPr>
-      </w:pPr>
-    </w:p>
-    <w:p>
-      <w:pPr>
-        <w:ind w:left="-284" w:firstLine="284"/>
+          <w:color w:val="000000" w:themeColor="text1"/>
+        </w:rPr>
+      </w:pPr>
+    </w:p>
+    <w:p>
+      <w:pPr>
+        <w:spacing w:line="360" w:lineRule="auto"/>
         <w:jc w:val="both"/>
         <w:rPr>
           <w:rFonts w:ascii="Arial" w:hAnsi="Arial" w:cs="Arial"/>
-        </w:rPr>
-      </w:pPr>
-    </w:p>
-    <w:p>
-      <w:pPr>
+          <w:color w:val="000000" w:themeColor="text1"/>
+          <w:lang w:val="es-ES"/>
+        </w:rPr>
+      </w:pPr>
+      <w:r>
+        <w:rPr>
+          <w:rFonts w:ascii="Arial" w:hAnsi="Arial" w:cs="Arial"/>
+          <w:color w:val="000000" w:themeColor="text1"/>
+          <w:lang w:val="es-ES"/>
+        </w:rPr>
+        <w:t xml:space="preserve">{{FIRMA}}</w:t>
+      </w:r>
+    </w:p>
+    <w:p>
+      <w:pPr>
+        <w:spacing w:line="360" w:lineRule="auto"/>
         <w:jc w:val="both"/>
-        <w:rPr>
-          <w:rFonts w:ascii="Arial" w:hAnsi="Arial" w:cs="Arial"/>
-        </w:rPr>
-      </w:pPr>
-    </w:p>
-    <w:p>
-      <w:pPr>
-        <w:jc w:val="both"/>
-        <w:rPr>
-          <w:rFonts w:ascii="Arial" w:hAnsi="Arial" w:cs="Arial"/>
-        </w:rPr>
-      </w:pPr>
-    </w:p>
-    <w:p>
-      <w:pPr>
-        <w:jc w:val="both"/>
-        <w:rPr>
-          <w:rFonts w:ascii="Arial" w:hAnsi="Arial" w:cs="Arial"/>
-        </w:rPr>
-      </w:pPr>
-      <w:r>
-        <w:rPr>
-          <w:rFonts w:ascii="Arial" w:hAnsi="Arial" w:cs="Arial"/>
-        </w:rPr>
-        <w:t>_______________________________________</w:t>
-      </w:r>
-    </w:p>
-    <w:p>
-      <w:pPr>
         <w:rPr>
           <w:rFonts w:ascii="Arial" w:hAnsi="Arial" w:cs="Arial"/>
           <w:b/>
@@ -3031,59 +2503,12 @@
           <w:bCs/>
           <w:color w:val="000000" w:themeColor="text1"/>
         </w:rPr>
-        <w:t xml:space="preserve">            {{FIRMA}}</w:t>
-      </w:r>
-    </w:p>
-    <w:p>
-      <w:pPr>
-        <w:rPr>
-          <w:rFonts w:ascii="Arial" w:hAnsi="Arial" w:cs="Arial"/>
-          <w:b/>
-          <w:bCs/>
-          <w:color w:val="000000" w:themeColor="text1"/>
-        </w:rPr>
-      </w:pPr>
-      <w:r>
-        <w:rPr>
-          <w:rFonts w:ascii="Arial" w:hAnsi="Arial" w:cs="Arial"/>
-          <w:b/>
-          <w:bCs/>
-          <w:color w:val="000000" w:themeColor="text1"/>
-          <w:lang w:val="es-ES"/>
-        </w:rPr>
-        <w:t xml:space="preserve">Supervisor de Gestión Humana Sector </w:t>
-      </w:r>
-      <w:r>
-        <w:rPr>
-          <w:rFonts w:ascii="Arial" w:hAnsi="Arial" w:cs="Arial"/>
-          <w:b/>
-          <w:bCs/>
-          <w:color w:val="000000" w:themeColor="text1"/>
-          <w:lang w:val="es-ES"/>
-        </w:rPr>
-        <w:t xml:space="preserve">{{SECTORFIRMA}}</w:t>
-      </w:r>
-    </w:p>
-    <w:p>
-      <w:pPr>
-        <w:jc w:val="both"/>
-        <w:rPr>
-          <w:rFonts w:ascii="Arial" w:hAnsi="Arial" w:cs="Arial"/>
-          <w:color w:val="000000" w:themeColor="text1"/>
-        </w:rPr>
-      </w:pPr>
-    </w:p>
-    <w:p>
-      <w:pPr>
-        <w:ind w:left="-284" w:firstLine="284"/>
-        <w:jc w:val="both"/>
-        <w:rPr>
-          <w:rFonts w:ascii="Arial" w:hAnsi="Arial" w:cs="Arial"/>
-        </w:rPr>
-      </w:pPr>
-    </w:p>
-    <w:p>
-      <w:pPr>
+        <w:t xml:space="preserve">Supervisor de Gestión Humana Sector {{SECTORFIRMA}}</w:t>
+      </w:r>
+    </w:p>
+    <w:p>
+      <w:pPr>
+        <w:spacing w:line="360" w:lineRule="auto"/>
         <w:ind w:left="-284"/>
         <w:jc w:val="both"/>
         <w:rPr>
@@ -3093,6 +2518,7 @@
     </w:p>
     <w:p>
       <w:pPr>
+        <w:spacing w:line="360" w:lineRule="auto"/>
         <w:ind w:left="-284"/>
         <w:jc w:val="both"/>
         <w:rPr>
@@ -3102,6 +2528,7 @@
     </w:p>
     <w:p>
       <w:pPr>
+        <w:spacing w:line="360" w:lineRule="auto"/>
         <w:ind w:left="1080" w:hanging="720"/>
         <w:jc w:val="both"/>
         <w:rPr>
@@ -3165,20 +2592,9 @@
         </w:rPr>
       </w:pPr>
     </w:p>
-    <w:p>
-      <w:pPr>
-        <w:tabs>
-          <w:tab w:val="left" w:pos="5670"/>
-        </w:tabs>
-        <w:rPr>
-          <w:rFonts w:ascii="Arial" w:hAnsi="Arial" w:cs="Arial"/>
-          <w:color w:val="000000"/>
-        </w:rPr>
-      </w:pPr>
-    </w:p>
     <w:sectPr>
-      <w:headerReference w:type="default" r:id="rId14"/>
-      <w:footerReference w:type="default" r:id="rId15"/>
+      <w:headerReference w:type="default" r:id="rId9"/>
+      <w:footerReference w:type="default" r:id="rId10"/>
       <w:pgSz w:w="11906" w:h="16838"/>
       <w:pgMar w:top="1418" w:right="1701" w:bottom="1418" w:left="1701" w:header="709" w:footer="709" w:gutter="0"/>
       <w:cols w:space="708"/>
@@ -3222,16 +2638,6 @@
         <w:lang w:val="es-419"/>
       </w:rPr>
     </w:pPr>
-    <w:r>
-      <w:rPr>
-        <w:rFonts w:ascii="Arial" w:hAnsi="Arial" w:cs="Arial"/>
-        <w:color w:val="000000" w:themeColor="text1"/>
-        <w:sz w:val="14"/>
-        <w:szCs w:val="14"/>
-        <w:lang w:val="es-419"/>
-      </w:rPr>
-      <w:t>El contenido de este documento es propiedad exclusiva de Unifrutti. Su reproducción o copia total y/o parcial requiere una solicitud escrita y expresa al departamento de Sustentabilidad y Certificaciones, en cumplimiento con el sistema de gestión de la empresa y su control de documentos.</w:t>
-    </w:r>
   </w:p>
   <w:p>
     <w:pPr>
@@ -3522,6 +2928,7 @@
             </w:rPr>
             <w:t xml:space="preserve">Versión </w:t>
           </w:r>
+          <w:proofErr w:type="spellStart"/>
           <w:r>
             <w:rPr>
               <w:rFonts w:ascii="Arial" w:hAnsi="Arial" w:cs="Arial"/>
@@ -3529,7 +2936,17 @@
               <w:sz w:val="18"/>
               <w:szCs w:val="18"/>
             </w:rPr>
-            <w:t xml:space="preserve">N° </w:t>
+            <w:t>N°</w:t>
+          </w:r>
+          <w:proofErr w:type="spellEnd"/>
+          <w:r>
+            <w:rPr>
+              <w:rFonts w:ascii="Arial" w:hAnsi="Arial" w:cs="Arial"/>
+              <w:b/>
+              <w:sz w:val="18"/>
+              <w:szCs w:val="18"/>
+            </w:rPr>
+            <w:t xml:space="preserve"> </w:t>
           </w:r>
           <w:r>
             <w:rPr>
@@ -3706,118 +3123,6 @@
 <file path=word/numbering.xml><?xml version="1.0" encoding="utf-8"?>
 <w:numbering xmlns:wpc="http://schemas.microsoft.com/office/word/2010/wordprocessingCanvas" xmlns:cx="http://schemas.microsoft.com/office/drawing/2014/chartex" xmlns:cx1="http://schemas.microsoft.com/office/drawing/2015/9/8/chartex" xmlns:cx2="http://schemas.microsoft.com/office/drawing/2015/10/21/chartex" xmlns:cx3="http://schemas.microsoft.com/office/drawing/2016/5/9/chartex" xmlns:cx4="http://schemas.microsoft.com/office/drawing/2016/5/10/chartex" xmlns:cx5="http://schemas.microsoft.com/office/drawing/2016/5/11/chartex" xmlns:cx6="http://schemas.microsoft.com/office/drawing/2016/5/12/chartex" xmlns:cx7="http://schemas.microsoft.com/office/drawing/2016/5/13/chartex" xmlns:cx8="http://schemas.microsoft.com/office/drawing/2016/5/14/chartex" xmlns:mc="http://schemas.openxmlformats.org/markup-compatibility/2006" xmlns:aink="http://schemas.microsoft.com/office/drawing/2016/ink" xmlns:am3d="http://schemas.microsoft.com/office/drawing/2017/model3d" xmlns:o="urn:schemas-microsoft-com:office:office" xmlns:oel="http://schemas.microsoft.com/office/2019/extlst" xmlns:r="http://schemas.openxmlformats.org/officeDocument/2006/relationships" xmlns:m="http://schemas.openxmlformats.org/officeDocument/2006/math" xmlns:v="urn:schemas-microsoft-com:vml" xmlns:wp14="http://schemas.microsoft.com/office/word/2010/wordprocessingDrawing" xmlns:wp="http://schemas.openxmlformats.org/drawingml/2006/wordprocessingDrawing" xmlns:w10="urn:schemas-microsoft-com:office:word" xmlns:w="http://schemas.openxmlformats.org/wordprocessingml/2006/main" xmlns:w14="http://schemas.microsoft.com/office/word/2010/wordml" xmlns:w15="http://schemas.microsoft.com/office/word/2012/wordml" xmlns:w16cex="http://schemas.microsoft.com/office/word/2018/wordml/cex" xmlns:w16cid="http://schemas.microsoft.com/office/word/2016/wordml/cid" xmlns:w16="http://schemas.microsoft.com/office/word/2018/wordml" xmlns:w16du="http://schemas.microsoft.com/office/word/2023/wordml/word16du" xmlns:w16sdtdh="http://schemas.microsoft.com/office/word/2020/wordml/sdtdatahash" xmlns:w16sdtfl="http://schemas.microsoft.com/office/word/2024/wordml/sdtformatlock" xmlns:w16se="http://schemas.microsoft.com/office/word/2015/wordml/symex" xmlns:wpg="http://schemas.microsoft.com/office/word/2010/wordprocessingGroup" xmlns:wpi="http://schemas.microsoft.com/office/word/2010/wordprocessingInk" xmlns:wne="http://schemas.microsoft.com/office/word/2006/wordml" xmlns:wps="http://schemas.microsoft.com/office/word/2010/wordprocessingShape" mc:Ignorable="w14 w15 w16se w16cid w16 w16cex w16sdtdh w16sdtfl w16du wp14">
   <w:abstractNum w:abstractNumId="0" w15:restartNumberingAfterBreak="0">
-    <w:nsid w:val="00B00D0D"/>
-    <w:multiLevelType w:val="hybridMultilevel"/>
-    <w:tmpl w:val="DF52C79E"/>
-    <w:lvl w:ilvl="0" w:tplc="F6EEB6D4">
-      <w:numFmt w:val="bullet"/>
-      <w:lvlText w:val="-"/>
-      <w:lvlJc w:val="left"/>
-      <w:pPr>
-        <w:ind w:left="720" w:hanging="360"/>
-      </w:pPr>
-      <w:rPr>
-        <w:rFonts w:ascii="Calibri" w:eastAsia="Times New Roman" w:hAnsi="Calibri" w:cs="Arial" w:hint="default"/>
-      </w:rPr>
-    </w:lvl>
-    <w:lvl w:ilvl="1" w:tplc="280A0003" w:tentative="1">
-      <w:start w:val="1"/>
-      <w:numFmt w:val="bullet"/>
-      <w:lvlText w:val="o"/>
-      <w:lvlJc w:val="left"/>
-      <w:pPr>
-        <w:ind w:left="1440" w:hanging="360"/>
-      </w:pPr>
-      <w:rPr>
-        <w:rFonts w:ascii="Courier New" w:hAnsi="Courier New" w:cs="Courier New" w:hint="default"/>
-      </w:rPr>
-    </w:lvl>
-    <w:lvl w:ilvl="2" w:tplc="280A0005" w:tentative="1">
-      <w:start w:val="1"/>
-      <w:numFmt w:val="bullet"/>
-      <w:lvlText w:val=""/>
-      <w:lvlJc w:val="left"/>
-      <w:pPr>
-        <w:ind w:left="2160" w:hanging="360"/>
-      </w:pPr>
-      <w:rPr>
-        <w:rFonts w:ascii="Wingdings" w:hAnsi="Wingdings" w:hint="default"/>
-      </w:rPr>
-    </w:lvl>
-    <w:lvl w:ilvl="3" w:tplc="280A0001" w:tentative="1">
-      <w:start w:val="1"/>
-      <w:numFmt w:val="bullet"/>
-      <w:lvlText w:val=""/>
-      <w:lvlJc w:val="left"/>
-      <w:pPr>
-        <w:ind w:left="2880" w:hanging="360"/>
-      </w:pPr>
-      <w:rPr>
-        <w:rFonts w:ascii="Symbol" w:hAnsi="Symbol" w:hint="default"/>
-      </w:rPr>
-    </w:lvl>
-    <w:lvl w:ilvl="4" w:tplc="280A0003" w:tentative="1">
-      <w:start w:val="1"/>
-      <w:numFmt w:val="bullet"/>
-      <w:lvlText w:val="o"/>
-      <w:lvlJc w:val="left"/>
-      <w:pPr>
-        <w:ind w:left="3600" w:hanging="360"/>
-      </w:pPr>
-      <w:rPr>
-        <w:rFonts w:ascii="Courier New" w:hAnsi="Courier New" w:cs="Courier New" w:hint="default"/>
-      </w:rPr>
-    </w:lvl>
-    <w:lvl w:ilvl="5" w:tplc="280A0005" w:tentative="1">
-      <w:start w:val="1"/>
-      <w:numFmt w:val="bullet"/>
-      <w:lvlText w:val=""/>
-      <w:lvlJc w:val="left"/>
-      <w:pPr>
-        <w:ind w:left="4320" w:hanging="360"/>
-      </w:pPr>
-      <w:rPr>
-        <w:rFonts w:ascii="Wingdings" w:hAnsi="Wingdings" w:hint="default"/>
-      </w:rPr>
-    </w:lvl>
-    <w:lvl w:ilvl="6" w:tplc="280A0001" w:tentative="1">
-      <w:start w:val="1"/>
-      <w:numFmt w:val="bullet"/>
-      <w:lvlText w:val=""/>
-      <w:lvlJc w:val="left"/>
-      <w:pPr>
-        <w:ind w:left="5040" w:hanging="360"/>
-      </w:pPr>
-      <w:rPr>
-        <w:rFonts w:ascii="Symbol" w:hAnsi="Symbol" w:hint="default"/>
-      </w:rPr>
-    </w:lvl>
-    <w:lvl w:ilvl="7" w:tplc="280A0003" w:tentative="1">
-      <w:start w:val="1"/>
-      <w:numFmt w:val="bullet"/>
-      <w:lvlText w:val="o"/>
-      <w:lvlJc w:val="left"/>
-      <w:pPr>
-        <w:ind w:left="5760" w:hanging="360"/>
-      </w:pPr>
-      <w:rPr>
-        <w:rFonts w:ascii="Courier New" w:hAnsi="Courier New" w:cs="Courier New" w:hint="default"/>
-      </w:rPr>
-    </w:lvl>
-    <w:lvl w:ilvl="8" w:tplc="280A0005" w:tentative="1">
-      <w:start w:val="1"/>
-      <w:numFmt w:val="bullet"/>
-      <w:lvlText w:val=""/>
-      <w:lvlJc w:val="left"/>
-      <w:pPr>
-        <w:ind w:left="6480" w:hanging="360"/>
-      </w:pPr>
-      <w:rPr>
-        <w:rFonts w:ascii="Wingdings" w:hAnsi="Wingdings" w:hint="default"/>
-      </w:rPr>
-    </w:lvl>
-  </w:abstractNum>
-  <w:abstractNum w:abstractNumId="1" w15:restartNumberingAfterBreak="0">
     <w:nsid w:val="0E476F5A"/>
     <w:multiLevelType w:val="hybridMultilevel"/>
     <w:tmpl w:val="914481DE"/>
@@ -3906,7 +3211,7 @@
       </w:pPr>
     </w:lvl>
   </w:abstractNum>
-  <w:abstractNum w:abstractNumId="2" w15:restartNumberingAfterBreak="0">
+  <w:abstractNum w:abstractNumId="1" w15:restartNumberingAfterBreak="0">
     <w:nsid w:val="130C6B6C"/>
     <w:multiLevelType w:val="hybridMultilevel"/>
     <w:tmpl w:val="A11885AC"/>
@@ -3992,7 +3297,7 @@
       </w:pPr>
     </w:lvl>
   </w:abstractNum>
-  <w:abstractNum w:abstractNumId="3" w15:restartNumberingAfterBreak="0">
+  <w:abstractNum w:abstractNumId="2" w15:restartNumberingAfterBreak="0">
     <w:nsid w:val="28893D37"/>
     <w:multiLevelType w:val="hybridMultilevel"/>
     <w:tmpl w:val="55C4D16E"/>
@@ -4105,7 +3410,7 @@
       </w:rPr>
     </w:lvl>
   </w:abstractNum>
-  <w:abstractNum w:abstractNumId="4" w15:restartNumberingAfterBreak="0">
+  <w:abstractNum w:abstractNumId="3" w15:restartNumberingAfterBreak="0">
     <w:nsid w:val="335805AB"/>
     <w:multiLevelType w:val="hybridMultilevel"/>
     <w:tmpl w:val="6924EDF0"/>
@@ -4219,7 +3524,7 @@
       </w:rPr>
     </w:lvl>
   </w:abstractNum>
-  <w:abstractNum w:abstractNumId="5" w15:restartNumberingAfterBreak="0">
+  <w:abstractNum w:abstractNumId="4" w15:restartNumberingAfterBreak="0">
     <w:nsid w:val="3461220A"/>
     <w:multiLevelType w:val="hybridMultilevel"/>
     <w:tmpl w:val="DC880EF2"/>
@@ -4332,7 +3637,7 @@
       </w:rPr>
     </w:lvl>
   </w:abstractNum>
-  <w:abstractNum w:abstractNumId="6" w15:restartNumberingAfterBreak="0">
+  <w:abstractNum w:abstractNumId="5" w15:restartNumberingAfterBreak="0">
     <w:nsid w:val="3763115B"/>
     <w:multiLevelType w:val="hybridMultilevel"/>
     <w:tmpl w:val="067E91A4"/>
@@ -4445,7 +3750,7 @@
       </w:rPr>
     </w:lvl>
   </w:abstractNum>
-  <w:abstractNum w:abstractNumId="7" w15:restartNumberingAfterBreak="0">
+  <w:abstractNum w:abstractNumId="6" w15:restartNumberingAfterBreak="0">
     <w:nsid w:val="416C08CC"/>
     <w:multiLevelType w:val="hybridMultilevel"/>
     <w:tmpl w:val="3D646E3A"/>
@@ -4557,7 +3862,7 @@
       </w:rPr>
     </w:lvl>
   </w:abstractNum>
-  <w:abstractNum w:abstractNumId="8" w15:restartNumberingAfterBreak="0">
+  <w:abstractNum w:abstractNumId="7" w15:restartNumberingAfterBreak="0">
     <w:nsid w:val="45F750AB"/>
     <w:multiLevelType w:val="hybridMultilevel"/>
     <w:tmpl w:val="0316AD32"/>
@@ -4643,7 +3948,7 @@
       </w:pPr>
     </w:lvl>
   </w:abstractNum>
-  <w:abstractNum w:abstractNumId="9" w15:restartNumberingAfterBreak="0">
+  <w:abstractNum w:abstractNumId="8" w15:restartNumberingAfterBreak="0">
     <w:nsid w:val="4E653AFE"/>
     <w:multiLevelType w:val="hybridMultilevel"/>
     <w:tmpl w:val="A810D9A4"/>
@@ -4756,156 +4061,7 @@
       </w:rPr>
     </w:lvl>
   </w:abstractNum>
-  <w:abstractNum w:abstractNumId="10" w15:restartNumberingAfterBreak="0">
-    <w:nsid w:val="58EB0B52"/>
-    <w:multiLevelType w:val="multilevel"/>
-    <w:tmpl w:val="09C878B8"/>
-    <w:lvl w:ilvl="0">
-      <w:start w:val="1"/>
-      <w:numFmt w:val="bullet"/>
-      <w:lvlText w:val=""/>
-      <w:lvlJc w:val="left"/>
-      <w:pPr>
-        <w:tabs>
-          <w:tab w:val="num" w:pos="720"/>
-        </w:tabs>
-        <w:ind w:left="720" w:hanging="360"/>
-      </w:pPr>
-      <w:rPr>
-        <w:rFonts w:ascii="Symbol" w:hAnsi="Symbol" w:hint="default"/>
-        <w:sz w:val="20"/>
-      </w:rPr>
-    </w:lvl>
-    <w:lvl w:ilvl="1" w:tentative="1">
-      <w:start w:val="1"/>
-      <w:numFmt w:val="bullet"/>
-      <w:lvlText w:val="o"/>
-      <w:lvlJc w:val="left"/>
-      <w:pPr>
-        <w:tabs>
-          <w:tab w:val="num" w:pos="1440"/>
-        </w:tabs>
-        <w:ind w:left="1440" w:hanging="360"/>
-      </w:pPr>
-      <w:rPr>
-        <w:rFonts w:ascii="Courier New" w:hAnsi="Courier New" w:hint="default"/>
-        <w:sz w:val="20"/>
-      </w:rPr>
-    </w:lvl>
-    <w:lvl w:ilvl="2" w:tentative="1">
-      <w:start w:val="1"/>
-      <w:numFmt w:val="bullet"/>
-      <w:lvlText w:val=""/>
-      <w:lvlJc w:val="left"/>
-      <w:pPr>
-        <w:tabs>
-          <w:tab w:val="num" w:pos="2160"/>
-        </w:tabs>
-        <w:ind w:left="2160" w:hanging="360"/>
-      </w:pPr>
-      <w:rPr>
-        <w:rFonts w:ascii="Wingdings" w:hAnsi="Wingdings" w:hint="default"/>
-        <w:sz w:val="20"/>
-      </w:rPr>
-    </w:lvl>
-    <w:lvl w:ilvl="3" w:tentative="1">
-      <w:start w:val="1"/>
-      <w:numFmt w:val="bullet"/>
-      <w:lvlText w:val=""/>
-      <w:lvlJc w:val="left"/>
-      <w:pPr>
-        <w:tabs>
-          <w:tab w:val="num" w:pos="2880"/>
-        </w:tabs>
-        <w:ind w:left="2880" w:hanging="360"/>
-      </w:pPr>
-      <w:rPr>
-        <w:rFonts w:ascii="Wingdings" w:hAnsi="Wingdings" w:hint="default"/>
-        <w:sz w:val="20"/>
-      </w:rPr>
-    </w:lvl>
-    <w:lvl w:ilvl="4" w:tentative="1">
-      <w:start w:val="1"/>
-      <w:numFmt w:val="bullet"/>
-      <w:lvlText w:val=""/>
-      <w:lvlJc w:val="left"/>
-      <w:pPr>
-        <w:tabs>
-          <w:tab w:val="num" w:pos="3600"/>
-        </w:tabs>
-        <w:ind w:left="3600" w:hanging="360"/>
-      </w:pPr>
-      <w:rPr>
-        <w:rFonts w:ascii="Wingdings" w:hAnsi="Wingdings" w:hint="default"/>
-        <w:sz w:val="20"/>
-      </w:rPr>
-    </w:lvl>
-    <w:lvl w:ilvl="5" w:tentative="1">
-      <w:start w:val="1"/>
-      <w:numFmt w:val="bullet"/>
-      <w:lvlText w:val=""/>
-      <w:lvlJc w:val="left"/>
-      <w:pPr>
-        <w:tabs>
-          <w:tab w:val="num" w:pos="4320"/>
-        </w:tabs>
-        <w:ind w:left="4320" w:hanging="360"/>
-      </w:pPr>
-      <w:rPr>
-        <w:rFonts w:ascii="Wingdings" w:hAnsi="Wingdings" w:hint="default"/>
-        <w:sz w:val="20"/>
-      </w:rPr>
-    </w:lvl>
-    <w:lvl w:ilvl="6" w:tentative="1">
-      <w:start w:val="1"/>
-      <w:numFmt w:val="bullet"/>
-      <w:lvlText w:val=""/>
-      <w:lvlJc w:val="left"/>
-      <w:pPr>
-        <w:tabs>
-          <w:tab w:val="num" w:pos="5040"/>
-        </w:tabs>
-        <w:ind w:left="5040" w:hanging="360"/>
-      </w:pPr>
-      <w:rPr>
-        <w:rFonts w:ascii="Wingdings" w:hAnsi="Wingdings" w:hint="default"/>
-        <w:sz w:val="20"/>
-      </w:rPr>
-    </w:lvl>
-    <w:lvl w:ilvl="7" w:tentative="1">
-      <w:start w:val="1"/>
-      <w:numFmt w:val="bullet"/>
-      <w:lvlText w:val=""/>
-      <w:lvlJc w:val="left"/>
-      <w:pPr>
-        <w:tabs>
-          <w:tab w:val="num" w:pos="5760"/>
-        </w:tabs>
-        <w:ind w:left="5760" w:hanging="360"/>
-      </w:pPr>
-      <w:rPr>
-        <w:rFonts w:ascii="Wingdings" w:hAnsi="Wingdings" w:hint="default"/>
-        <w:sz w:val="20"/>
-      </w:rPr>
-    </w:lvl>
-    <w:lvl w:ilvl="8" w:tentative="1">
-      <w:start w:val="1"/>
-      <w:numFmt w:val="bullet"/>
-      <w:lvlText w:val=""/>
-      <w:lvlJc w:val="left"/>
-      <w:pPr>
-        <w:tabs>
-          <w:tab w:val="num" w:pos="6480"/>
-        </w:tabs>
-        <w:ind w:left="6480" w:hanging="360"/>
-      </w:pPr>
-      <w:rPr>
-        <w:rFonts w:ascii="Wingdings" w:hAnsi="Wingdings" w:hint="default"/>
-        <w:sz w:val="20"/>
-      </w:rPr>
-    </w:lvl>
-  </w:abstractNum>
-  <w:abstractNum w:abstractNumId="11" w15:restartNumberingAfterBreak="0">
+  <w:abstractNum w:abstractNumId="9" w15:restartNumberingAfterBreak="0">
     <w:nsid w:val="6EDD51D0"/>
     <w:multiLevelType w:val="hybridMultilevel"/>
     <w:tmpl w:val="1A22F634"/>
@@ -4995,40 +4151,34 @@
     </w:lvl>
   </w:abstractNum>
   <w:num w:numId="1" w16cid:durableId="380835178">
+    <w:abstractNumId w:val="7"/>
+  </w:num>
+  <w:num w:numId="2" w16cid:durableId="56516678">
+    <w:abstractNumId w:val="5"/>
+  </w:num>
+  <w:num w:numId="3" w16cid:durableId="1771972727">
+    <w:abstractNumId w:val="2"/>
+  </w:num>
+  <w:num w:numId="4" w16cid:durableId="335042396">
+    <w:abstractNumId w:val="4"/>
+  </w:num>
+  <w:num w:numId="5" w16cid:durableId="328094268">
     <w:abstractNumId w:val="8"/>
   </w:num>
-  <w:num w:numId="2" w16cid:durableId="56516678">
-    <w:abstractNumId w:val="6"/>
+  <w:num w:numId="6" w16cid:durableId="1698576270">
+    <w:abstractNumId w:val="1"/>
   </w:num>
-  <w:num w:numId="3" w16cid:durableId="1771972727">
+  <w:num w:numId="7" w16cid:durableId="193735270">
+    <w:abstractNumId w:val="0"/>
+  </w:num>
+  <w:num w:numId="8" w16cid:durableId="305087851">
+    <w:abstractNumId w:val="9"/>
+  </w:num>
+  <w:num w:numId="9" w16cid:durableId="1319918423">
     <w:abstractNumId w:val="3"/>
   </w:num>
-  <w:num w:numId="4" w16cid:durableId="335042396">
-    <w:abstractNumId w:val="5"/>
-  </w:num>
-  <w:num w:numId="5" w16cid:durableId="328094268">
-    <w:abstractNumId w:val="9"/>
-  </w:num>
-  <w:num w:numId="6" w16cid:durableId="1698576270">
-    <w:abstractNumId w:val="2"/>
-  </w:num>
-  <w:num w:numId="7" w16cid:durableId="193735270">
-    <w:abstractNumId w:val="1"/>
-  </w:num>
-  <w:num w:numId="8" w16cid:durableId="305087851">
-    <w:abstractNumId w:val="11"/>
-  </w:num>
-  <w:num w:numId="9" w16cid:durableId="1319918423">
-    <w:abstractNumId w:val="4"/>
-  </w:num>
   <w:num w:numId="10" w16cid:durableId="1851026800">
-    <w:abstractNumId w:val="7"/>
-  </w:num>
-  <w:num w:numId="11" w16cid:durableId="2144345726">
-    <w:abstractNumId w:val="0"/>
-  </w:num>
-  <w:num w:numId="12" w16cid:durableId="1202475130">
-    <w:abstractNumId w:val="10"/>
+    <w:abstractNumId w:val="6"/>
   </w:num>
 </w:numbering>
 </file>
@@ -5433,7 +4583,7 @@
   <w:style w:type="paragraph" w:default="1" w:styleId="Normal">
     <w:name w:val="Normal"/>
     <w:qFormat/>
-    <w:rsid w:val="00336A9C"/>
+    <w:rsid w:val="00892CAF"/>
     <w:pPr>
       <w:overflowPunct w:val="0"/>
       <w:autoSpaceDE w:val="0"/>
@@ -5586,18 +4736,6 @@
         <w:insideV w:val="single" w:sz="4" w:space="0" w:color="auto"/>
       </w:tblBorders>
     </w:tblPr>
-  </w:style>
-  <w:style w:type="paragraph" w:styleId="NormalWeb">
-    <w:name w:val="Normal (Web)"/>
-    <w:basedOn w:val="Normal"/>
-    <w:uiPriority w:val="99"/>
-    <w:semiHidden/>
-    <w:unhideWhenUsed/>
-    <w:rsid w:val="00D6345F"/>
-    <w:rPr>
-      <w:sz w:val="24"/>
-      <w:szCs w:val="24"/>
-    </w:rPr>
   </w:style>
 </w:styles>
 </file>

</xml_diff>